<commit_message>
Update Sales Order Layout
</commit_message>
<xml_diff>
--- a/src/ReportExt/SalesOrderConfirmation.docx
+++ b/src/ReportExt/SalesOrderConfirmation.docx
@@ -1,6 +1,6 @@
 
 <file path=word/document.xml><?xml version="1.0" encoding="utf-8"?>
-<w:document xmlns:a="http://schemas.openxmlformats.org/drawingml/2006/main" xmlns:pic="http://schemas.openxmlformats.org/drawingml/2006/picture" xmlns:wpc="http://schemas.microsoft.com/office/word/2010/wordprocessingCanvas" xmlns:cx="http://schemas.microsoft.com/office/drawing/2014/chartex" xmlns:cx1="http://schemas.microsoft.com/office/drawing/2015/9/8/chartex" xmlns:cx2="http://schemas.microsoft.com/office/drawing/2015/10/21/chartex" xmlns:cx3="http://schemas.microsoft.com/office/drawing/2016/5/9/chartex" xmlns:cx4="http://schemas.microsoft.com/office/drawing/2016/5/10/chartex" xmlns:cx5="http://schemas.microsoft.com/office/drawing/2016/5/11/chartex" xmlns:cx6="http://schemas.microsoft.com/office/drawing/2016/5/12/chartex" xmlns:cx7="http://schemas.microsoft.com/office/drawing/2016/5/13/chartex" xmlns:cx8="http://schemas.microsoft.com/office/drawing/2016/5/14/chartex" xmlns:mc="http://schemas.openxmlformats.org/markup-compatibility/2006" xmlns:aink="http://schemas.microsoft.com/office/drawing/2016/ink" xmlns:am3d="http://schemas.microsoft.com/office/drawing/2017/model3d" xmlns:o="urn:schemas-microsoft-com:office:office" xmlns:oel="http://schemas.microsoft.com/office/2019/extlst" xmlns:r="http://schemas.openxmlformats.org/officeDocument/2006/relationships" xmlns:m="http://schemas.openxmlformats.org/officeDocument/2006/math" xmlns:v="urn:schemas-microsoft-com:vml" xmlns:wp14="http://schemas.microsoft.com/office/word/2010/wordprocessingDrawing" xmlns:wp="http://schemas.openxmlformats.org/drawingml/2006/wordprocessingDrawing" xmlns:w10="urn:schemas-microsoft-com:office:word" xmlns:w="http://schemas.openxmlformats.org/wordprocessingml/2006/main" xmlns:w14="http://schemas.microsoft.com/office/word/2010/wordml" xmlns:w15="http://schemas.microsoft.com/office/word/2012/wordml" xmlns:w16cex="http://schemas.microsoft.com/office/word/2018/wordml/cex" xmlns:w16cid="http://schemas.microsoft.com/office/word/2016/wordml/cid" xmlns:w16="http://schemas.microsoft.com/office/word/2018/wordml" xmlns:w16sdtdh="http://schemas.microsoft.com/office/word/2020/wordml/sdtdatahash" xmlns:w16se="http://schemas.microsoft.com/office/word/2015/wordml/symex" xmlns:wpg="http://schemas.microsoft.com/office/word/2010/wordprocessingGroup" xmlns:wpi="http://schemas.microsoft.com/office/word/2010/wordprocessingInk" xmlns:wne="http://schemas.microsoft.com/office/word/2006/wordml" xmlns:wps="http://schemas.microsoft.com/office/word/2010/wordprocessingShape" mc:Ignorable="w14 w15 w16se w16cid w16 w16cex w16sdtdh wp14">
+<w:document xmlns:a="http://schemas.openxmlformats.org/drawingml/2006/main" xmlns:pic="http://schemas.openxmlformats.org/drawingml/2006/picture" xmlns:wpc="http://schemas.microsoft.com/office/word/2010/wordprocessingCanvas" xmlns:cx="http://schemas.microsoft.com/office/drawing/2014/chartex" xmlns:cx1="http://schemas.microsoft.com/office/drawing/2015/9/8/chartex" xmlns:cx2="http://schemas.microsoft.com/office/drawing/2015/10/21/chartex" xmlns:cx3="http://schemas.microsoft.com/office/drawing/2016/5/9/chartex" xmlns:cx4="http://schemas.microsoft.com/office/drawing/2016/5/10/chartex" xmlns:cx5="http://schemas.microsoft.com/office/drawing/2016/5/11/chartex" xmlns:cx6="http://schemas.microsoft.com/office/drawing/2016/5/12/chartex" xmlns:cx7="http://schemas.microsoft.com/office/drawing/2016/5/13/chartex" xmlns:cx8="http://schemas.microsoft.com/office/drawing/2016/5/14/chartex" xmlns:mc="http://schemas.openxmlformats.org/markup-compatibility/2006" xmlns:aink="http://schemas.microsoft.com/office/drawing/2016/ink" xmlns:am3d="http://schemas.microsoft.com/office/drawing/2017/model3d" xmlns:o="urn:schemas-microsoft-com:office:office" xmlns:oel="http://schemas.microsoft.com/office/2019/extlst" xmlns:r="http://schemas.openxmlformats.org/officeDocument/2006/relationships" xmlns:m="http://schemas.openxmlformats.org/officeDocument/2006/math" xmlns:v="urn:schemas-microsoft-com:vml" xmlns:wp14="http://schemas.microsoft.com/office/word/2010/wordprocessingDrawing" xmlns:wp="http://schemas.openxmlformats.org/drawingml/2006/wordprocessingDrawing" xmlns:w10="urn:schemas-microsoft-com:office:word" xmlns:w="http://schemas.openxmlformats.org/wordprocessingml/2006/main" xmlns:w14="http://schemas.microsoft.com/office/word/2010/wordml" xmlns:w15="http://schemas.microsoft.com/office/word/2012/wordml" xmlns:w16cex="http://schemas.microsoft.com/office/word/2018/wordml/cex" xmlns:w16cid="http://schemas.microsoft.com/office/word/2016/wordml/cid" xmlns:w16="http://schemas.microsoft.com/office/word/2018/wordml" xmlns:w16du="http://schemas.microsoft.com/office/word/2023/wordml/word16du" xmlns:w16sdtdh="http://schemas.microsoft.com/office/word/2020/wordml/sdtdatahash" xmlns:w16sdtfl="http://schemas.microsoft.com/office/word/2024/wordml/sdtformatlock" xmlns:w16se="http://schemas.microsoft.com/office/word/2015/wordml/symex" xmlns:wpg="http://schemas.microsoft.com/office/word/2010/wordprocessingGroup" xmlns:wpi="http://schemas.microsoft.com/office/word/2010/wordprocessingInk" xmlns:wne="http://schemas.microsoft.com/office/word/2006/wordml" xmlns:wps="http://schemas.microsoft.com/office/word/2010/wordprocessingShape" mc:Ignorable="w14 w15 w16se w16cid w16 w16cex w16sdtdh w16sdtfl w16du wp14">
   <w:body>
     <w:tbl>
       <w:tblPr>
@@ -22,9 +22,8 @@
         <w:tblLook w:val="04A0" w:firstRow="1" w:lastRow="0" w:firstColumn="1" w:lastColumn="0" w:noHBand="0" w:noVBand="1"/>
       </w:tblPr>
       <w:tblGrid>
-        <w:gridCol w:w="4058"/>
-        <w:gridCol w:w="3518"/>
-        <w:gridCol w:w="194"/>
+        <w:gridCol w:w="3801"/>
+        <w:gridCol w:w="3969"/>
         <w:gridCol w:w="3300"/>
       </w:tblGrid>
       <w:tr>
@@ -34,7 +33,7 @@
         <w:tc>
           <w:tcPr>
             <w:tcW w:w="7770" w:type="dxa"/>
-            <w:gridSpan w:val="3"/>
+            <w:gridSpan w:val="2"/>
             <w:vAlign w:val="center"/>
           </w:tcPr>
           <w:p>
@@ -281,7 +280,7 @@
         </w:trPr>
         <w:tc>
           <w:tcPr>
-            <w:tcW w:w="4058" w:type="dxa"/>
+            <w:tcW w:w="3801" w:type="dxa"/>
             <w:vAlign w:val="bottom"/>
           </w:tcPr>
           <w:p>
@@ -325,7 +324,7 @@
           <w:sdtContent>
             <w:tc>
               <w:tcPr>
-                <w:tcW w:w="3518" w:type="dxa"/>
+                <w:tcW w:w="3969" w:type="dxa"/>
                 <w:vAlign w:val="bottom"/>
               </w:tcPr>
               <w:p>
@@ -355,8 +354,7 @@
         </w:sdt>
         <w:tc>
           <w:tcPr>
-            <w:tcW w:w="3494" w:type="dxa"/>
-            <w:gridSpan w:val="2"/>
+            <w:tcW w:w="3300" w:type="dxa"/>
             <w:vAlign w:val="center"/>
           </w:tcPr>
           <w:p>
@@ -426,7 +424,7 @@
           <w:sdtContent>
             <w:tc>
               <w:tcPr>
-                <w:tcW w:w="4058" w:type="dxa"/>
+                <w:tcW w:w="3801" w:type="dxa"/>
               </w:tcPr>
               <w:p>
                 <w:pPr>
@@ -456,19 +454,16 @@
               <w:sz w:val="20"/>
               <w:szCs w:val="20"/>
             </w:rPr>
-            <w:alias w:val="#Nav: /Header/ShipToAddress1"/>
-            <w:tag w:val="#Nav: Standard_Sales_Order_Conf/1305"/>
-            <w:id w:val="-2112802966"/>
+            <w:id w:val="816153250"/>
             <w:placeholder>
-              <w:docPart w:val="F42A0F919AF247C4B014FCC7C8DB1764"/>
+              <w:docPart w:val="DefaultPlaceholder_-1854013440"/>
             </w:placeholder>
-            <w:dataBinding w:prefixMappings="xmlns:ns0='urn:microsoft-dynamics-nav/reports/Standard_Sales_Order_Conf/1305/'" w:xpath="/ns0:NavWordReportXmlPart[1]/ns0:Header[1]/ns0:ShipToAddress1[1]" w:storeItemID="{EE782172-FD63-4F4B-B896-592DF0FBA5DC}"/>
-            <w:text/>
+            <w15:dataBinding w:prefixMappings="xmlns:ns0='urn:microsoft-dynamics-nav/reports/Standard_Sales_Order_Conf/1305/' " w:xpath="/ns0:NavWordReportXmlPart[1]/ns0:Header[1]/ns0:Ship_to_Name[1]" w:storeItemID="{EE782172-FD63-4F4B-B896-592DF0FBA5DC}" w16sdtdh:storeItemChecksum="czGwtQ=="/>
           </w:sdtPr>
           <w:sdtContent>
             <w:tc>
               <w:tcPr>
-                <w:tcW w:w="3518" w:type="dxa"/>
+                <w:tcW w:w="3969" w:type="dxa"/>
               </w:tcPr>
               <w:p>
                 <w:pPr>
@@ -478,21 +473,22 @@
                     <w:szCs w:val="20"/>
                   </w:rPr>
                 </w:pPr>
+                <w:proofErr w:type="spellStart"/>
                 <w:r>
                   <w:rPr>
                     <w:sz w:val="20"/>
                     <w:szCs w:val="20"/>
                   </w:rPr>
-                  <w:t>ShipToAddress1</w:t>
+                  <w:t>Ship_to_Name</w:t>
                 </w:r>
+                <w:proofErr w:type="spellEnd"/>
               </w:p>
             </w:tc>
           </w:sdtContent>
         </w:sdt>
         <w:tc>
           <w:tcPr>
-            <w:tcW w:w="3494" w:type="dxa"/>
-            <w:gridSpan w:val="2"/>
+            <w:tcW w:w="3300" w:type="dxa"/>
             <w:vAlign w:val="center"/>
           </w:tcPr>
           <w:p>
@@ -556,7 +552,7 @@
           <w:sdtContent>
             <w:tc>
               <w:tcPr>
-                <w:tcW w:w="4058" w:type="dxa"/>
+                <w:tcW w:w="3801" w:type="dxa"/>
               </w:tcPr>
               <w:p>
                 <w:pPr>
@@ -585,19 +581,16 @@
               <w:sz w:val="20"/>
               <w:szCs w:val="20"/>
             </w:rPr>
-            <w:alias w:val="#Nav: /Header/ShipToAddress2"/>
-            <w:tag w:val="#Nav: Standard_Sales_Order_Conf/1305"/>
-            <w:id w:val="-1031335786"/>
+            <w:id w:val="-1064631732"/>
             <w:placeholder>
-              <w:docPart w:val="29C1C062BD834767BAEE000994A6B181"/>
+              <w:docPart w:val="DefaultPlaceholder_-1854013440"/>
             </w:placeholder>
-            <w:dataBinding w:prefixMappings="xmlns:ns0='urn:microsoft-dynamics-nav/reports/Standard_Sales_Order_Conf/1305/'" w:xpath="/ns0:NavWordReportXmlPart[1]/ns0:Header[1]/ns0:ShipToAddress2[1]" w:storeItemID="{EE782172-FD63-4F4B-B896-592DF0FBA5DC}"/>
-            <w:text/>
+            <w15:dataBinding w:prefixMappings="xmlns:ns0='urn:microsoft-dynamics-nav/reports/Standard_Sales_Order_Conf/1305/' " w:xpath="/ns0:NavWordReportXmlPart[1]/ns0:Header[1]/ns0:Ship_to_Address[1]" w:storeItemID="{EE782172-FD63-4F4B-B896-592DF0FBA5DC}" w16sdtdh:storeItemChecksum="czGwtQ=="/>
           </w:sdtPr>
           <w:sdtContent>
             <w:tc>
               <w:tcPr>
-                <w:tcW w:w="3518" w:type="dxa"/>
+                <w:tcW w:w="3969" w:type="dxa"/>
               </w:tcPr>
               <w:p>
                 <w:pPr>
@@ -607,21 +600,22 @@
                     <w:szCs w:val="20"/>
                   </w:rPr>
                 </w:pPr>
+                <w:proofErr w:type="spellStart"/>
                 <w:r>
                   <w:rPr>
                     <w:sz w:val="20"/>
                     <w:szCs w:val="20"/>
                   </w:rPr>
-                  <w:t>ShipToAddress2</w:t>
+                  <w:t>Ship_to_Address</w:t>
                 </w:r>
+                <w:proofErr w:type="spellEnd"/>
               </w:p>
             </w:tc>
           </w:sdtContent>
         </w:sdt>
         <w:tc>
           <w:tcPr>
-            <w:tcW w:w="3494" w:type="dxa"/>
-            <w:gridSpan w:val="2"/>
+            <w:tcW w:w="3300" w:type="dxa"/>
             <w:vAlign w:val="center"/>
           </w:tcPr>
           <w:p>
@@ -685,7 +679,7 @@
           <w:sdtContent>
             <w:tc>
               <w:tcPr>
-                <w:tcW w:w="4058" w:type="dxa"/>
+                <w:tcW w:w="3801" w:type="dxa"/>
               </w:tcPr>
               <w:p>
                 <w:pPr>
@@ -715,19 +709,16 @@
               <w:sz w:val="20"/>
               <w:szCs w:val="20"/>
             </w:rPr>
-            <w:alias w:val="#Nav: /Header/ShipToAddress3"/>
-            <w:tag w:val="#Nav: Standard_Sales_Order_Conf/1305"/>
-            <w:id w:val="1520125911"/>
+            <w:id w:val="-2039960040"/>
             <w:placeholder>
-              <w:docPart w:val="068D40E5187643C3AB0DC1E56D6FD480"/>
+              <w:docPart w:val="DefaultPlaceholder_-1854013440"/>
             </w:placeholder>
-            <w:dataBinding w:prefixMappings="xmlns:ns0='urn:microsoft-dynamics-nav/reports/Standard_Sales_Order_Conf/1305/'" w:xpath="/ns0:NavWordReportXmlPart[1]/ns0:Header[1]/ns0:ShipToAddress3[1]" w:storeItemID="{EE782172-FD63-4F4B-B896-592DF0FBA5DC}"/>
-            <w:text/>
+            <w15:dataBinding w:prefixMappings="xmlns:ns0='urn:microsoft-dynamics-nav/reports/Standard_Sales_Order_Conf/1305/' " w:xpath="/ns0:NavWordReportXmlPart[1]/ns0:Header[1]/ns0:Ship_to_Address_2[1]" w:storeItemID="{EE782172-FD63-4F4B-B896-592DF0FBA5DC}" w16sdtdh:storeItemChecksum="czGwtQ=="/>
           </w:sdtPr>
           <w:sdtContent>
             <w:tc>
               <w:tcPr>
-                <w:tcW w:w="3518" w:type="dxa"/>
+                <w:tcW w:w="3969" w:type="dxa"/>
               </w:tcPr>
               <w:p>
                 <w:pPr>
@@ -742,7 +733,7 @@
                     <w:sz w:val="20"/>
                     <w:szCs w:val="20"/>
                   </w:rPr>
-                  <w:t>ShipToAddress3</w:t>
+                  <w:t>Ship_to_Address_2</w:t>
                 </w:r>
               </w:p>
             </w:tc>
@@ -766,8 +757,7 @@
           <w:sdtContent>
             <w:tc>
               <w:tcPr>
-                <w:tcW w:w="3494" w:type="dxa"/>
-                <w:gridSpan w:val="2"/>
+                <w:tcW w:w="3300" w:type="dxa"/>
                 <w:vAlign w:val="center"/>
               </w:tcPr>
               <w:p>
@@ -817,7 +807,7 @@
           <w:sdtContent>
             <w:tc>
               <w:tcPr>
-                <w:tcW w:w="4058" w:type="dxa"/>
+                <w:tcW w:w="3801" w:type="dxa"/>
               </w:tcPr>
               <w:p>
                 <w:pPr>
@@ -841,49 +831,116 @@
             </w:tc>
           </w:sdtContent>
         </w:sdt>
-        <w:sdt>
-          <w:sdtPr>
-            <w:rPr>
-              <w:sz w:val="20"/>
-              <w:szCs w:val="20"/>
-            </w:rPr>
-            <w:alias w:val="#Nav: /Header/ShipToAddress4"/>
-            <w:tag w:val="#Nav: Standard_Sales_Order_Conf/1305"/>
-            <w:id w:val="1979024194"/>
-            <w:placeholder>
-              <w:docPart w:val="F14BA88672C444DDB23BF9227B557931"/>
-            </w:placeholder>
-            <w:dataBinding w:prefixMappings="xmlns:ns0='urn:microsoft-dynamics-nav/reports/Standard_Sales_Order_Conf/1305/'" w:xpath="/ns0:NavWordReportXmlPart[1]/ns0:Header[1]/ns0:ShipToAddress4[1]" w:storeItemID="{EE782172-FD63-4F4B-B896-592DF0FBA5DC}"/>
-            <w:text/>
-          </w:sdtPr>
-          <w:sdtContent>
-            <w:tc>
-              <w:tcPr>
-                <w:tcW w:w="3518" w:type="dxa"/>
-              </w:tcPr>
-              <w:p>
-                <w:pPr>
-                  <w:pStyle w:val="Sinespaciado"/>
-                  <w:rPr>
-                    <w:sz w:val="20"/>
-                    <w:szCs w:val="20"/>
-                  </w:rPr>
-                </w:pPr>
+        <w:tc>
+          <w:tcPr>
+            <w:tcW w:w="3969" w:type="dxa"/>
+          </w:tcPr>
+          <w:p>
+            <w:pPr>
+              <w:pStyle w:val="Sinespaciado"/>
+              <w:rPr>
+                <w:sz w:val="20"/>
+                <w:szCs w:val="20"/>
+              </w:rPr>
+            </w:pPr>
+            <w:sdt>
+              <w:sdtPr>
+                <w:rPr>
+                  <w:sz w:val="20"/>
+                  <w:szCs w:val="20"/>
+                </w:rPr>
+                <w:id w:val="-844169776"/>
+                <w:placeholder>
+                  <w:docPart w:val="DefaultPlaceholder_-1854013440"/>
+                </w:placeholder>
+                <w15:dataBinding w:prefixMappings="xmlns:ns0='urn:microsoft-dynamics-nav/reports/Standard_Sales_Order_Conf/1305/' " w:xpath="/ns0:NavWordReportXmlPart[1]/ns0:Header[1]/ns0:Ship_to_City[1]" w:storeItemID="{EE782172-FD63-4F4B-B896-592DF0FBA5DC}" w16sdtdh:storeItemChecksum="czGwtQ=="/>
+              </w:sdtPr>
+              <w:sdtContent>
+                <w:proofErr w:type="spellStart"/>
                 <w:r>
                   <w:rPr>
                     <w:sz w:val="20"/>
                     <w:szCs w:val="20"/>
                   </w:rPr>
-                  <w:t>ShipToAddress4</w:t>
+                  <w:t>Ship_to_City</w:t>
                 </w:r>
-              </w:p>
-            </w:tc>
-          </w:sdtContent>
-        </w:sdt>
+                <w:proofErr w:type="spellEnd"/>
+              </w:sdtContent>
+            </w:sdt>
+            <w:r>
+              <w:rPr>
+                <w:sz w:val="20"/>
+                <w:szCs w:val="20"/>
+              </w:rPr>
+              <w:t>,</w:t>
+            </w:r>
+            <w:r>
+              <w:rPr>
+                <w:sz w:val="20"/>
+                <w:szCs w:val="20"/>
+              </w:rPr>
+              <w:t xml:space="preserve"> </w:t>
+            </w:r>
+            <w:sdt>
+              <w:sdtPr>
+                <w:rPr>
+                  <w:sz w:val="20"/>
+                  <w:szCs w:val="20"/>
+                </w:rPr>
+                <w:id w:val="1096289595"/>
+                <w:placeholder>
+                  <w:docPart w:val="DefaultPlaceholder_-1854013440"/>
+                </w:placeholder>
+                <w15:dataBinding w:prefixMappings="xmlns:ns0='urn:microsoft-dynamics-nav/reports/Standard_Sales_Order_Conf/1305/' " w:xpath="/ns0:NavWordReportXmlPart[1]/ns0:Header[1]/ns0:Ship_to_County[1]" w:storeItemID="{EE782172-FD63-4F4B-B896-592DF0FBA5DC}" w16sdtdh:storeItemChecksum="czGwtQ=="/>
+              </w:sdtPr>
+              <w:sdtContent>
+                <w:proofErr w:type="spellStart"/>
+                <w:r>
+                  <w:rPr>
+                    <w:sz w:val="20"/>
+                    <w:szCs w:val="20"/>
+                  </w:rPr>
+                  <w:t>Ship_to_County</w:t>
+                </w:r>
+                <w:proofErr w:type="spellEnd"/>
+              </w:sdtContent>
+            </w:sdt>
+            <w:r>
+              <w:rPr>
+                <w:sz w:val="20"/>
+                <w:szCs w:val="20"/>
+              </w:rPr>
+              <w:t xml:space="preserve"> </w:t>
+            </w:r>
+            <w:sdt>
+              <w:sdtPr>
+                <w:rPr>
+                  <w:sz w:val="20"/>
+                  <w:szCs w:val="20"/>
+                </w:rPr>
+                <w:id w:val="2092506786"/>
+                <w:placeholder>
+                  <w:docPart w:val="DefaultPlaceholder_-1854013440"/>
+                </w:placeholder>
+                <w15:dataBinding w:prefixMappings="xmlns:ns0='urn:microsoft-dynamics-nav/reports/Standard_Sales_Order_Conf/1305/' " w:xpath="/ns0:NavWordReportXmlPart[1]/ns0:Header[1]/ns0:Ship_to_Post_Code[1]" w:storeItemID="{EE782172-FD63-4F4B-B896-592DF0FBA5DC}" w16sdtdh:storeItemChecksum="czGwtQ=="/>
+              </w:sdtPr>
+              <w:sdtContent>
+                <w:proofErr w:type="spellStart"/>
+                <w:r>
+                  <w:rPr>
+                    <w:sz w:val="20"/>
+                    <w:szCs w:val="20"/>
+                  </w:rPr>
+                  <w:t>Ship_to_Post_Code</w:t>
+                </w:r>
+                <w:proofErr w:type="spellEnd"/>
+              </w:sdtContent>
+            </w:sdt>
+          </w:p>
+        </w:tc>
         <w:tc>
           <w:tcPr>
-            <w:tcW w:w="3494" w:type="dxa"/>
-            <w:gridSpan w:val="2"/>
+            <w:tcW w:w="3300" w:type="dxa"/>
             <w:vAlign w:val="center"/>
           </w:tcPr>
           <w:p>
@@ -891,6 +948,9 @@
               <w:pStyle w:val="Sinespaciado"/>
               <w:jc w:val="right"/>
             </w:pPr>
+            <w:r>
+              <w:t xml:space="preserve"> </w:t>
+            </w:r>
           </w:p>
         </w:tc>
       </w:tr>
@@ -918,7 +978,7 @@
           <w:sdtContent>
             <w:tc>
               <w:tcPr>
-                <w:tcW w:w="4058" w:type="dxa"/>
+                <w:tcW w:w="3801" w:type="dxa"/>
               </w:tcPr>
               <w:p>
                 <w:pPr>
@@ -947,19 +1007,16 @@
               <w:sz w:val="20"/>
               <w:szCs w:val="20"/>
             </w:rPr>
-            <w:alias w:val="#Nav: /Header/ShipToAddress5"/>
-            <w:tag w:val="#Nav: Standard_Sales_Order_Conf/1305"/>
-            <w:id w:val="1261961521"/>
+            <w:id w:val="191734457"/>
             <w:placeholder>
-              <w:docPart w:val="40538E0F8B3A4106A553DF036562555C"/>
+              <w:docPart w:val="DefaultPlaceholder_-1854013440"/>
             </w:placeholder>
-            <w:dataBinding w:prefixMappings="xmlns:ns0='urn:microsoft-dynamics-nav/reports/Standard_Sales_Order_Conf/1305/'" w:xpath="/ns0:NavWordReportXmlPart[1]/ns0:Header[1]/ns0:ShipToAddress5[1]" w:storeItemID="{EE782172-FD63-4F4B-B896-592DF0FBA5DC}"/>
-            <w:text/>
+            <w15:dataBinding w:prefixMappings="xmlns:ns0='urn:microsoft-dynamics-nav/reports/Standard_Sales_Order_Conf/1305/' " w:xpath="/ns0:NavWordReportXmlPart[1]/ns0:Header[1]/ns0:Ship_to_Country_Region_Code[1]" w:storeItemID="{EE782172-FD63-4F4B-B896-592DF0FBA5DC}" w16sdtdh:storeItemChecksum="czGwtQ=="/>
           </w:sdtPr>
           <w:sdtContent>
             <w:tc>
               <w:tcPr>
-                <w:tcW w:w="3518" w:type="dxa"/>
+                <w:tcW w:w="3969" w:type="dxa"/>
               </w:tcPr>
               <w:p>
                 <w:pPr>
@@ -969,21 +1026,22 @@
                     <w:szCs w:val="20"/>
                   </w:rPr>
                 </w:pPr>
+                <w:proofErr w:type="spellStart"/>
                 <w:r>
                   <w:rPr>
                     <w:sz w:val="20"/>
                     <w:szCs w:val="20"/>
                   </w:rPr>
-                  <w:t>ShipToAddress5</w:t>
+                  <w:t>Ship_to_Country_Region_Code</w:t>
                 </w:r>
+                <w:proofErr w:type="spellEnd"/>
               </w:p>
             </w:tc>
           </w:sdtContent>
         </w:sdt>
         <w:tc>
           <w:tcPr>
-            <w:tcW w:w="3494" w:type="dxa"/>
-            <w:gridSpan w:val="2"/>
+            <w:tcW w:w="3300" w:type="dxa"/>
             <w:vAlign w:val="center"/>
           </w:tcPr>
           <w:p>
@@ -1021,7 +1079,7 @@
           <w:sdtContent>
             <w:tc>
               <w:tcPr>
-                <w:tcW w:w="4058" w:type="dxa"/>
+                <w:tcW w:w="3801" w:type="dxa"/>
               </w:tcPr>
               <w:p>
                 <w:pPr>
@@ -1045,49 +1103,23 @@
             </w:tc>
           </w:sdtContent>
         </w:sdt>
-        <w:sdt>
-          <w:sdtPr>
-            <w:rPr>
-              <w:sz w:val="20"/>
-              <w:szCs w:val="20"/>
-            </w:rPr>
-            <w:alias w:val="#Nav: /Header/ShipToAddress6"/>
-            <w:tag w:val="#Nav: Standard_Sales_Order_Conf/1305"/>
-            <w:id w:val="950364648"/>
-            <w:placeholder>
-              <w:docPart w:val="6AC74AD5E465469D85EBE42897407DAE"/>
-            </w:placeholder>
-            <w:dataBinding w:prefixMappings="xmlns:ns0='urn:microsoft-dynamics-nav/reports/Standard_Sales_Order_Conf/1305/'" w:xpath="/ns0:NavWordReportXmlPart[1]/ns0:Header[1]/ns0:ShipToAddress6[1]" w:storeItemID="{EE782172-FD63-4F4B-B896-592DF0FBA5DC}"/>
-            <w:text/>
-          </w:sdtPr>
-          <w:sdtContent>
-            <w:tc>
-              <w:tcPr>
-                <w:tcW w:w="3518" w:type="dxa"/>
-              </w:tcPr>
-              <w:p>
-                <w:pPr>
-                  <w:pStyle w:val="Sinespaciado"/>
-                  <w:rPr>
-                    <w:sz w:val="20"/>
-                    <w:szCs w:val="20"/>
-                  </w:rPr>
-                </w:pPr>
-                <w:r>
-                  <w:rPr>
-                    <w:sz w:val="20"/>
-                    <w:szCs w:val="20"/>
-                  </w:rPr>
-                  <w:t>ShipToAddress6</w:t>
-                </w:r>
-              </w:p>
-            </w:tc>
-          </w:sdtContent>
-        </w:sdt>
         <w:tc>
           <w:tcPr>
-            <w:tcW w:w="3494" w:type="dxa"/>
-            <w:gridSpan w:val="2"/>
+            <w:tcW w:w="3969" w:type="dxa"/>
+          </w:tcPr>
+          <w:p>
+            <w:pPr>
+              <w:pStyle w:val="Sinespaciado"/>
+              <w:rPr>
+                <w:sz w:val="20"/>
+                <w:szCs w:val="20"/>
+              </w:rPr>
+            </w:pPr>
+          </w:p>
+        </w:tc>
+        <w:tc>
+          <w:tcPr>
+            <w:tcW w:w="3300" w:type="dxa"/>
             <w:vAlign w:val="center"/>
           </w:tcPr>
           <w:p>
@@ -2023,7 +2055,7 @@
             <w:sdtContent>
               <w:tr>
                 <w:trPr>
-                  <w:trHeight w:val="572"/>
+                  <w:trHeight w:val="698"/>
                 </w:trPr>
                 <w:sdt>
                   <w:sdtPr>
@@ -2110,7 +2142,7 @@
                     <w:placeholder>
                       <w:docPart w:val="239BEA89DBDA41068F3A7CAEF29E4AD0"/>
                     </w:placeholder>
-                    <w15:dataBinding w:prefixMappings="xmlns:ns0='urn:microsoft-dynamics-nav/reports/Standard_Sales_Order_Conf/1305/' " w:xpath="/ns0:NavWordReportXmlPart[1]/ns0:Header[1]/ns0:Line[1]/ns0:Location_Code[1]" w:storeItemID="{EE782172-FD63-4F4B-B896-592DF0FBA5DC}" w16sdtdh:storeItemChecksum="/PGTcg=="/>
+                    <w15:dataBinding w:prefixMappings="xmlns:ns0='urn:microsoft-dynamics-nav/reports/Standard_Sales_Order_Conf/1305/' " w:xpath="/ns0:NavWordReportXmlPart[1]/ns0:Header[1]/ns0:Line[1]/ns0:Location_Code[1]" w:storeItemID="{EE782172-FD63-4F4B-B896-592DF0FBA5DC}" w16sdtdh:storeItemChecksum="czGwtQ=="/>
                   </w:sdtPr>
                   <w:sdtContent>
                     <w:tc>
@@ -2177,13 +2209,13 @@
                     <w:rPr>
                       <w:sz w:val="20"/>
                     </w:rPr>
+                    <w:alias w:val="#Nav: /Header/Line/Description_2"/>
+                    <w:tag w:val="#Nav: Standard_Sales_Order_Conf/1305"/>
                     <w:id w:val="-909763818"/>
                     <w:placeholder>
                       <w:docPart w:val="DefaultPlaceholder_-1854013440"/>
                     </w:placeholder>
-                    <w15:dataBinding w:prefixMappings="xmlns:ns0='urn:microsoft-dynamics-nav/reports/Standard_Sales_Order_Conf/1305/' " w:xpath="/ns0:NavWordReportXmlPart[1]/ns0:Header[1]/ns0:Line[1]/ns0:Description_2[1]" w:storeItemID="{EE782172-FD63-4F4B-B896-592DF0FBA5DC}" w16sdtdh:storeItemChecksum="/PGTcg=="/>
-                    <w:alias w:val="#Nav: /Header/Line/Description_2"/>
-                    <w:tag w:val="#Nav: Standard_Sales_Order_Conf/1305"/>
+                    <w15:dataBinding w:prefixMappings="xmlns:ns0='urn:microsoft-dynamics-nav/reports/Standard_Sales_Order_Conf/1305/' " w:xpath="/ns0:NavWordReportXmlPart[1]/ns0:Header[1]/ns0:Line[1]/ns0:Description_2[1]" w:storeItemID="{EE782172-FD63-4F4B-B896-592DF0FBA5DC}" w16sdtdh:storeItemChecksum="czGwtQ=="/>
                   </w:sdtPr>
                   <w:sdtContent>
                     <w:tc>
@@ -2764,14 +2796,34 @@
               <w:rPr>
                 <w:sz w:val="20"/>
                 <w:szCs w:val="20"/>
+                <w:lang w:val="es-419"/>
               </w:rPr>
             </w:pPr>
             <w:r>
               <w:rPr>
                 <w:sz w:val="20"/>
                 <w:szCs w:val="20"/>
+                <w:lang w:val="es-419"/>
               </w:rPr>
-              <w:t>ABA No. (9 digits): 267084131</w:t>
+              <w:t xml:space="preserve">ABA No. (9 </w:t>
+            </w:r>
+            <w:proofErr w:type="spellStart"/>
+            <w:r>
+              <w:rPr>
+                <w:sz w:val="20"/>
+                <w:szCs w:val="20"/>
+                <w:lang w:val="es-419"/>
+              </w:rPr>
+              <w:t>digits</w:t>
+            </w:r>
+            <w:proofErr w:type="spellEnd"/>
+            <w:r>
+              <w:rPr>
+                <w:sz w:val="20"/>
+                <w:szCs w:val="20"/>
+                <w:lang w:val="es-419"/>
+              </w:rPr>
+              <w:t>): 267084131</w:t>
             </w:r>
           </w:p>
           <w:p>
@@ -2782,14 +2834,34 @@
               <w:rPr>
                 <w:sz w:val="20"/>
                 <w:szCs w:val="20"/>
+                <w:lang w:val="es-419"/>
               </w:rPr>
             </w:pPr>
             <w:r>
               <w:rPr>
                 <w:sz w:val="20"/>
                 <w:szCs w:val="20"/>
+                <w:lang w:val="es-419"/>
               </w:rPr>
-              <w:t>Swift code: CHASUS33</w:t>
+              <w:t xml:space="preserve">Swift </w:t>
+            </w:r>
+            <w:proofErr w:type="spellStart"/>
+            <w:r>
+              <w:rPr>
+                <w:sz w:val="20"/>
+                <w:szCs w:val="20"/>
+                <w:lang w:val="es-419"/>
+              </w:rPr>
+              <w:t>code</w:t>
+            </w:r>
+            <w:proofErr w:type="spellEnd"/>
+            <w:r>
+              <w:rPr>
+                <w:sz w:val="20"/>
+                <w:szCs w:val="20"/>
+                <w:lang w:val="es-419"/>
+              </w:rPr>
+              <w:t>: CHASUS33</w:t>
             </w:r>
           </w:p>
           <w:p>
@@ -3332,7 +3404,7 @@
 </file>
 
 <file path=word/endnotes.xml><?xml version="1.0" encoding="utf-8"?>
-<w:endnotes xmlns:wpc="http://schemas.microsoft.com/office/word/2010/wordprocessingCanvas" xmlns:cx="http://schemas.microsoft.com/office/drawing/2014/chartex" xmlns:cx1="http://schemas.microsoft.com/office/drawing/2015/9/8/chartex" xmlns:cx2="http://schemas.microsoft.com/office/drawing/2015/10/21/chartex" xmlns:cx3="http://schemas.microsoft.com/office/drawing/2016/5/9/chartex" xmlns:cx4="http://schemas.microsoft.com/office/drawing/2016/5/10/chartex" xmlns:cx5="http://schemas.microsoft.com/office/drawing/2016/5/11/chartex" xmlns:cx6="http://schemas.microsoft.com/office/drawing/2016/5/12/chartex" xmlns:cx7="http://schemas.microsoft.com/office/drawing/2016/5/13/chartex" xmlns:cx8="http://schemas.microsoft.com/office/drawing/2016/5/14/chartex" xmlns:mc="http://schemas.openxmlformats.org/markup-compatibility/2006" xmlns:aink="http://schemas.microsoft.com/office/drawing/2016/ink" xmlns:am3d="http://schemas.microsoft.com/office/drawing/2017/model3d" xmlns:o="urn:schemas-microsoft-com:office:office" xmlns:oel="http://schemas.microsoft.com/office/2019/extlst" xmlns:r="http://schemas.openxmlformats.org/officeDocument/2006/relationships" xmlns:m="http://schemas.openxmlformats.org/officeDocument/2006/math" xmlns:v="urn:schemas-microsoft-com:vml" xmlns:wp14="http://schemas.microsoft.com/office/word/2010/wordprocessingDrawing" xmlns:wp="http://schemas.openxmlformats.org/drawingml/2006/wordprocessingDrawing" xmlns:w10="urn:schemas-microsoft-com:office:word" xmlns:w="http://schemas.openxmlformats.org/wordprocessingml/2006/main" xmlns:w14="http://schemas.microsoft.com/office/word/2010/wordml" xmlns:w15="http://schemas.microsoft.com/office/word/2012/wordml" xmlns:w16cex="http://schemas.microsoft.com/office/word/2018/wordml/cex" xmlns:w16cid="http://schemas.microsoft.com/office/word/2016/wordml/cid" xmlns:w16="http://schemas.microsoft.com/office/word/2018/wordml" xmlns:w16sdtdh="http://schemas.microsoft.com/office/word/2020/wordml/sdtdatahash" xmlns:w16se="http://schemas.microsoft.com/office/word/2015/wordml/symex" xmlns:wpg="http://schemas.microsoft.com/office/word/2010/wordprocessingGroup" xmlns:wpi="http://schemas.microsoft.com/office/word/2010/wordprocessingInk" xmlns:wne="http://schemas.microsoft.com/office/word/2006/wordml" xmlns:wps="http://schemas.microsoft.com/office/word/2010/wordprocessingShape" mc:Ignorable="w14 w15 w16se w16cid w16 w16cex w16sdtdh wp14">
+<w:endnotes xmlns:wpc="http://schemas.microsoft.com/office/word/2010/wordprocessingCanvas" xmlns:cx="http://schemas.microsoft.com/office/drawing/2014/chartex" xmlns:cx1="http://schemas.microsoft.com/office/drawing/2015/9/8/chartex" xmlns:cx2="http://schemas.microsoft.com/office/drawing/2015/10/21/chartex" xmlns:cx3="http://schemas.microsoft.com/office/drawing/2016/5/9/chartex" xmlns:cx4="http://schemas.microsoft.com/office/drawing/2016/5/10/chartex" xmlns:cx5="http://schemas.microsoft.com/office/drawing/2016/5/11/chartex" xmlns:cx6="http://schemas.microsoft.com/office/drawing/2016/5/12/chartex" xmlns:cx7="http://schemas.microsoft.com/office/drawing/2016/5/13/chartex" xmlns:cx8="http://schemas.microsoft.com/office/drawing/2016/5/14/chartex" xmlns:mc="http://schemas.openxmlformats.org/markup-compatibility/2006" xmlns:aink="http://schemas.microsoft.com/office/drawing/2016/ink" xmlns:am3d="http://schemas.microsoft.com/office/drawing/2017/model3d" xmlns:o="urn:schemas-microsoft-com:office:office" xmlns:oel="http://schemas.microsoft.com/office/2019/extlst" xmlns:r="http://schemas.openxmlformats.org/officeDocument/2006/relationships" xmlns:m="http://schemas.openxmlformats.org/officeDocument/2006/math" xmlns:v="urn:schemas-microsoft-com:vml" xmlns:wp14="http://schemas.microsoft.com/office/word/2010/wordprocessingDrawing" xmlns:wp="http://schemas.openxmlformats.org/drawingml/2006/wordprocessingDrawing" xmlns:w10="urn:schemas-microsoft-com:office:word" xmlns:w="http://schemas.openxmlformats.org/wordprocessingml/2006/main" xmlns:w14="http://schemas.microsoft.com/office/word/2010/wordml" xmlns:w15="http://schemas.microsoft.com/office/word/2012/wordml" xmlns:w16cex="http://schemas.microsoft.com/office/word/2018/wordml/cex" xmlns:w16cid="http://schemas.microsoft.com/office/word/2016/wordml/cid" xmlns:w16="http://schemas.microsoft.com/office/word/2018/wordml" xmlns:w16du="http://schemas.microsoft.com/office/word/2023/wordml/word16du" xmlns:w16sdtdh="http://schemas.microsoft.com/office/word/2020/wordml/sdtdatahash" xmlns:w16sdtfl="http://schemas.microsoft.com/office/word/2024/wordml/sdtformatlock" xmlns:w16se="http://schemas.microsoft.com/office/word/2015/wordml/symex" xmlns:wpg="http://schemas.microsoft.com/office/word/2010/wordprocessingGroup" xmlns:wpi="http://schemas.microsoft.com/office/word/2010/wordprocessingInk" xmlns:wne="http://schemas.microsoft.com/office/word/2006/wordml" xmlns:wps="http://schemas.microsoft.com/office/word/2010/wordprocessingShape" mc:Ignorable="w14 w15 w16se w16cid w16 w16cex w16sdtdh w16sdtfl w16du wp14">
   <w:endnote w:type="separator" w:id="-1">
     <w:p>
       <w:pPr>
@@ -3357,7 +3429,7 @@
 </file>
 
 <file path=word/footer1.xml><?xml version="1.0" encoding="utf-8"?>
-<w:ftr xmlns:wpc="http://schemas.microsoft.com/office/word/2010/wordprocessingCanvas" xmlns:cx="http://schemas.microsoft.com/office/drawing/2014/chartex" xmlns:cx1="http://schemas.microsoft.com/office/drawing/2015/9/8/chartex" xmlns:cx2="http://schemas.microsoft.com/office/drawing/2015/10/21/chartex" xmlns:cx3="http://schemas.microsoft.com/office/drawing/2016/5/9/chartex" xmlns:cx4="http://schemas.microsoft.com/office/drawing/2016/5/10/chartex" xmlns:cx5="http://schemas.microsoft.com/office/drawing/2016/5/11/chartex" xmlns:cx6="http://schemas.microsoft.com/office/drawing/2016/5/12/chartex" xmlns:cx7="http://schemas.microsoft.com/office/drawing/2016/5/13/chartex" xmlns:cx8="http://schemas.microsoft.com/office/drawing/2016/5/14/chartex" xmlns:mc="http://schemas.openxmlformats.org/markup-compatibility/2006" xmlns:aink="http://schemas.microsoft.com/office/drawing/2016/ink" xmlns:am3d="http://schemas.microsoft.com/office/drawing/2017/model3d" xmlns:o="urn:schemas-microsoft-com:office:office" xmlns:oel="http://schemas.microsoft.com/office/2019/extlst" xmlns:r="http://schemas.openxmlformats.org/officeDocument/2006/relationships" xmlns:m="http://schemas.openxmlformats.org/officeDocument/2006/math" xmlns:v="urn:schemas-microsoft-com:vml" xmlns:wp14="http://schemas.microsoft.com/office/word/2010/wordprocessingDrawing" xmlns:wp="http://schemas.openxmlformats.org/drawingml/2006/wordprocessingDrawing" xmlns:w10="urn:schemas-microsoft-com:office:word" xmlns:w="http://schemas.openxmlformats.org/wordprocessingml/2006/main" xmlns:w14="http://schemas.microsoft.com/office/word/2010/wordml" xmlns:w15="http://schemas.microsoft.com/office/word/2012/wordml" xmlns:w16cex="http://schemas.microsoft.com/office/word/2018/wordml/cex" xmlns:w16cid="http://schemas.microsoft.com/office/word/2016/wordml/cid" xmlns:w16="http://schemas.microsoft.com/office/word/2018/wordml" xmlns:w16sdtdh="http://schemas.microsoft.com/office/word/2020/wordml/sdtdatahash" xmlns:w16se="http://schemas.microsoft.com/office/word/2015/wordml/symex" xmlns:wpg="http://schemas.microsoft.com/office/word/2010/wordprocessingGroup" xmlns:wpi="http://schemas.microsoft.com/office/word/2010/wordprocessingInk" xmlns:wne="http://schemas.microsoft.com/office/word/2006/wordml" xmlns:wps="http://schemas.microsoft.com/office/word/2010/wordprocessingShape" mc:Ignorable="w14 w15 w16se w16cid w16 w16cex w16sdtdh wp14">
+<w:ftr xmlns:wpc="http://schemas.microsoft.com/office/word/2010/wordprocessingCanvas" xmlns:cx="http://schemas.microsoft.com/office/drawing/2014/chartex" xmlns:cx1="http://schemas.microsoft.com/office/drawing/2015/9/8/chartex" xmlns:cx2="http://schemas.microsoft.com/office/drawing/2015/10/21/chartex" xmlns:cx3="http://schemas.microsoft.com/office/drawing/2016/5/9/chartex" xmlns:cx4="http://schemas.microsoft.com/office/drawing/2016/5/10/chartex" xmlns:cx5="http://schemas.microsoft.com/office/drawing/2016/5/11/chartex" xmlns:cx6="http://schemas.microsoft.com/office/drawing/2016/5/12/chartex" xmlns:cx7="http://schemas.microsoft.com/office/drawing/2016/5/13/chartex" xmlns:cx8="http://schemas.microsoft.com/office/drawing/2016/5/14/chartex" xmlns:mc="http://schemas.openxmlformats.org/markup-compatibility/2006" xmlns:aink="http://schemas.microsoft.com/office/drawing/2016/ink" xmlns:am3d="http://schemas.microsoft.com/office/drawing/2017/model3d" xmlns:o="urn:schemas-microsoft-com:office:office" xmlns:oel="http://schemas.microsoft.com/office/2019/extlst" xmlns:r="http://schemas.openxmlformats.org/officeDocument/2006/relationships" xmlns:m="http://schemas.openxmlformats.org/officeDocument/2006/math" xmlns:v="urn:schemas-microsoft-com:vml" xmlns:wp14="http://schemas.microsoft.com/office/word/2010/wordprocessingDrawing" xmlns:wp="http://schemas.openxmlformats.org/drawingml/2006/wordprocessingDrawing" xmlns:w10="urn:schemas-microsoft-com:office:word" xmlns:w="http://schemas.openxmlformats.org/wordprocessingml/2006/main" xmlns:w14="http://schemas.microsoft.com/office/word/2010/wordml" xmlns:w15="http://schemas.microsoft.com/office/word/2012/wordml" xmlns:w16cex="http://schemas.microsoft.com/office/word/2018/wordml/cex" xmlns:w16cid="http://schemas.microsoft.com/office/word/2016/wordml/cid" xmlns:w16="http://schemas.microsoft.com/office/word/2018/wordml" xmlns:w16du="http://schemas.microsoft.com/office/word/2023/wordml/word16du" xmlns:w16sdtdh="http://schemas.microsoft.com/office/word/2020/wordml/sdtdatahash" xmlns:w16sdtfl="http://schemas.microsoft.com/office/word/2024/wordml/sdtformatlock" xmlns:w16se="http://schemas.microsoft.com/office/word/2015/wordml/symex" xmlns:wpg="http://schemas.microsoft.com/office/word/2010/wordprocessingGroup" xmlns:wpi="http://schemas.microsoft.com/office/word/2010/wordprocessingInk" xmlns:wne="http://schemas.microsoft.com/office/word/2006/wordml" xmlns:wps="http://schemas.microsoft.com/office/word/2010/wordprocessingShape" mc:Ignorable="w14 w15 w16se w16cid w16 w16cex w16sdtdh w16sdtfl w16du wp14">
   <w:p>
     <w:pPr>
       <w:pStyle w:val="Piedepgina"/>
@@ -3367,7 +3439,7 @@
 </file>
 
 <file path=word/footer2.xml><?xml version="1.0" encoding="utf-8"?>
-<w:ftr xmlns:wpc="http://schemas.microsoft.com/office/word/2010/wordprocessingCanvas" xmlns:cx="http://schemas.microsoft.com/office/drawing/2014/chartex" xmlns:cx1="http://schemas.microsoft.com/office/drawing/2015/9/8/chartex" xmlns:cx2="http://schemas.microsoft.com/office/drawing/2015/10/21/chartex" xmlns:cx3="http://schemas.microsoft.com/office/drawing/2016/5/9/chartex" xmlns:cx4="http://schemas.microsoft.com/office/drawing/2016/5/10/chartex" xmlns:cx5="http://schemas.microsoft.com/office/drawing/2016/5/11/chartex" xmlns:cx6="http://schemas.microsoft.com/office/drawing/2016/5/12/chartex" xmlns:cx7="http://schemas.microsoft.com/office/drawing/2016/5/13/chartex" xmlns:cx8="http://schemas.microsoft.com/office/drawing/2016/5/14/chartex" xmlns:mc="http://schemas.openxmlformats.org/markup-compatibility/2006" xmlns:aink="http://schemas.microsoft.com/office/drawing/2016/ink" xmlns:am3d="http://schemas.microsoft.com/office/drawing/2017/model3d" xmlns:o="urn:schemas-microsoft-com:office:office" xmlns:oel="http://schemas.microsoft.com/office/2019/extlst" xmlns:r="http://schemas.openxmlformats.org/officeDocument/2006/relationships" xmlns:m="http://schemas.openxmlformats.org/officeDocument/2006/math" xmlns:v="urn:schemas-microsoft-com:vml" xmlns:wp14="http://schemas.microsoft.com/office/word/2010/wordprocessingDrawing" xmlns:wp="http://schemas.openxmlformats.org/drawingml/2006/wordprocessingDrawing" xmlns:w10="urn:schemas-microsoft-com:office:word" xmlns:w="http://schemas.openxmlformats.org/wordprocessingml/2006/main" xmlns:w14="http://schemas.microsoft.com/office/word/2010/wordml" xmlns:w15="http://schemas.microsoft.com/office/word/2012/wordml" xmlns:w16cex="http://schemas.microsoft.com/office/word/2018/wordml/cex" xmlns:w16cid="http://schemas.microsoft.com/office/word/2016/wordml/cid" xmlns:w16="http://schemas.microsoft.com/office/word/2018/wordml" xmlns:w16sdtdh="http://schemas.microsoft.com/office/word/2020/wordml/sdtdatahash" xmlns:w16se="http://schemas.microsoft.com/office/word/2015/wordml/symex" xmlns:wpg="http://schemas.microsoft.com/office/word/2010/wordprocessingGroup" xmlns:wpi="http://schemas.microsoft.com/office/word/2010/wordprocessingInk" xmlns:wne="http://schemas.microsoft.com/office/word/2006/wordml" xmlns:wps="http://schemas.microsoft.com/office/word/2010/wordprocessingShape" mc:Ignorable="w14 w15 w16se w16cid w16 w16cex w16sdtdh wp14">
+<w:ftr xmlns:wpc="http://schemas.microsoft.com/office/word/2010/wordprocessingCanvas" xmlns:cx="http://schemas.microsoft.com/office/drawing/2014/chartex" xmlns:cx1="http://schemas.microsoft.com/office/drawing/2015/9/8/chartex" xmlns:cx2="http://schemas.microsoft.com/office/drawing/2015/10/21/chartex" xmlns:cx3="http://schemas.microsoft.com/office/drawing/2016/5/9/chartex" xmlns:cx4="http://schemas.microsoft.com/office/drawing/2016/5/10/chartex" xmlns:cx5="http://schemas.microsoft.com/office/drawing/2016/5/11/chartex" xmlns:cx6="http://schemas.microsoft.com/office/drawing/2016/5/12/chartex" xmlns:cx7="http://schemas.microsoft.com/office/drawing/2016/5/13/chartex" xmlns:cx8="http://schemas.microsoft.com/office/drawing/2016/5/14/chartex" xmlns:mc="http://schemas.openxmlformats.org/markup-compatibility/2006" xmlns:aink="http://schemas.microsoft.com/office/drawing/2016/ink" xmlns:am3d="http://schemas.microsoft.com/office/drawing/2017/model3d" xmlns:o="urn:schemas-microsoft-com:office:office" xmlns:oel="http://schemas.microsoft.com/office/2019/extlst" xmlns:r="http://schemas.openxmlformats.org/officeDocument/2006/relationships" xmlns:m="http://schemas.openxmlformats.org/officeDocument/2006/math" xmlns:v="urn:schemas-microsoft-com:vml" xmlns:wp14="http://schemas.microsoft.com/office/word/2010/wordprocessingDrawing" xmlns:wp="http://schemas.openxmlformats.org/drawingml/2006/wordprocessingDrawing" xmlns:w10="urn:schemas-microsoft-com:office:word" xmlns:w="http://schemas.openxmlformats.org/wordprocessingml/2006/main" xmlns:w14="http://schemas.microsoft.com/office/word/2010/wordml" xmlns:w15="http://schemas.microsoft.com/office/word/2012/wordml" xmlns:w16cex="http://schemas.microsoft.com/office/word/2018/wordml/cex" xmlns:w16cid="http://schemas.microsoft.com/office/word/2016/wordml/cid" xmlns:w16="http://schemas.microsoft.com/office/word/2018/wordml" xmlns:w16du="http://schemas.microsoft.com/office/word/2023/wordml/word16du" xmlns:w16sdtdh="http://schemas.microsoft.com/office/word/2020/wordml/sdtdatahash" xmlns:w16sdtfl="http://schemas.microsoft.com/office/word/2024/wordml/sdtformatlock" xmlns:w16se="http://schemas.microsoft.com/office/word/2015/wordml/symex" xmlns:wpg="http://schemas.microsoft.com/office/word/2010/wordprocessingGroup" xmlns:wpi="http://schemas.microsoft.com/office/word/2010/wordprocessingInk" xmlns:wne="http://schemas.microsoft.com/office/word/2006/wordml" xmlns:wps="http://schemas.microsoft.com/office/word/2010/wordprocessingShape" mc:Ignorable="w14 w15 w16se w16cid w16 w16cex w16sdtdh w16sdtfl w16du wp14">
   <w:tbl>
     <w:tblPr>
       <w:tblStyle w:val="Tablaconcuadrcula"/>
@@ -3442,7 +3514,7 @@
 </file>
 
 <file path=word/footer3.xml><?xml version="1.0" encoding="utf-8"?>
-<w:ftr xmlns:wpc="http://schemas.microsoft.com/office/word/2010/wordprocessingCanvas" xmlns:cx="http://schemas.microsoft.com/office/drawing/2014/chartex" xmlns:cx1="http://schemas.microsoft.com/office/drawing/2015/9/8/chartex" xmlns:cx2="http://schemas.microsoft.com/office/drawing/2015/10/21/chartex" xmlns:cx3="http://schemas.microsoft.com/office/drawing/2016/5/9/chartex" xmlns:cx4="http://schemas.microsoft.com/office/drawing/2016/5/10/chartex" xmlns:cx5="http://schemas.microsoft.com/office/drawing/2016/5/11/chartex" xmlns:cx6="http://schemas.microsoft.com/office/drawing/2016/5/12/chartex" xmlns:cx7="http://schemas.microsoft.com/office/drawing/2016/5/13/chartex" xmlns:cx8="http://schemas.microsoft.com/office/drawing/2016/5/14/chartex" xmlns:mc="http://schemas.openxmlformats.org/markup-compatibility/2006" xmlns:aink="http://schemas.microsoft.com/office/drawing/2016/ink" xmlns:am3d="http://schemas.microsoft.com/office/drawing/2017/model3d" xmlns:o="urn:schemas-microsoft-com:office:office" xmlns:oel="http://schemas.microsoft.com/office/2019/extlst" xmlns:r="http://schemas.openxmlformats.org/officeDocument/2006/relationships" xmlns:m="http://schemas.openxmlformats.org/officeDocument/2006/math" xmlns:v="urn:schemas-microsoft-com:vml" xmlns:wp14="http://schemas.microsoft.com/office/word/2010/wordprocessingDrawing" xmlns:wp="http://schemas.openxmlformats.org/drawingml/2006/wordprocessingDrawing" xmlns:w10="urn:schemas-microsoft-com:office:word" xmlns:w="http://schemas.openxmlformats.org/wordprocessingml/2006/main" xmlns:w14="http://schemas.microsoft.com/office/word/2010/wordml" xmlns:w15="http://schemas.microsoft.com/office/word/2012/wordml" xmlns:w16cex="http://schemas.microsoft.com/office/word/2018/wordml/cex" xmlns:w16cid="http://schemas.microsoft.com/office/word/2016/wordml/cid" xmlns:w16="http://schemas.microsoft.com/office/word/2018/wordml" xmlns:w16sdtdh="http://schemas.microsoft.com/office/word/2020/wordml/sdtdatahash" xmlns:w16se="http://schemas.microsoft.com/office/word/2015/wordml/symex" xmlns:wpg="http://schemas.microsoft.com/office/word/2010/wordprocessingGroup" xmlns:wpi="http://schemas.microsoft.com/office/word/2010/wordprocessingInk" xmlns:wne="http://schemas.microsoft.com/office/word/2006/wordml" xmlns:wps="http://schemas.microsoft.com/office/word/2010/wordprocessingShape" mc:Ignorable="w14 w15 w16se w16cid w16 w16cex w16sdtdh wp14">
+<w:ftr xmlns:wpc="http://schemas.microsoft.com/office/word/2010/wordprocessingCanvas" xmlns:cx="http://schemas.microsoft.com/office/drawing/2014/chartex" xmlns:cx1="http://schemas.microsoft.com/office/drawing/2015/9/8/chartex" xmlns:cx2="http://schemas.microsoft.com/office/drawing/2015/10/21/chartex" xmlns:cx3="http://schemas.microsoft.com/office/drawing/2016/5/9/chartex" xmlns:cx4="http://schemas.microsoft.com/office/drawing/2016/5/10/chartex" xmlns:cx5="http://schemas.microsoft.com/office/drawing/2016/5/11/chartex" xmlns:cx6="http://schemas.microsoft.com/office/drawing/2016/5/12/chartex" xmlns:cx7="http://schemas.microsoft.com/office/drawing/2016/5/13/chartex" xmlns:cx8="http://schemas.microsoft.com/office/drawing/2016/5/14/chartex" xmlns:mc="http://schemas.openxmlformats.org/markup-compatibility/2006" xmlns:aink="http://schemas.microsoft.com/office/drawing/2016/ink" xmlns:am3d="http://schemas.microsoft.com/office/drawing/2017/model3d" xmlns:o="urn:schemas-microsoft-com:office:office" xmlns:oel="http://schemas.microsoft.com/office/2019/extlst" xmlns:r="http://schemas.openxmlformats.org/officeDocument/2006/relationships" xmlns:m="http://schemas.openxmlformats.org/officeDocument/2006/math" xmlns:v="urn:schemas-microsoft-com:vml" xmlns:wp14="http://schemas.microsoft.com/office/word/2010/wordprocessingDrawing" xmlns:wp="http://schemas.openxmlformats.org/drawingml/2006/wordprocessingDrawing" xmlns:w10="urn:schemas-microsoft-com:office:word" xmlns:w="http://schemas.openxmlformats.org/wordprocessingml/2006/main" xmlns:w14="http://schemas.microsoft.com/office/word/2010/wordml" xmlns:w15="http://schemas.microsoft.com/office/word/2012/wordml" xmlns:w16cex="http://schemas.microsoft.com/office/word/2018/wordml/cex" xmlns:w16cid="http://schemas.microsoft.com/office/word/2016/wordml/cid" xmlns:w16="http://schemas.microsoft.com/office/word/2018/wordml" xmlns:w16du="http://schemas.microsoft.com/office/word/2023/wordml/word16du" xmlns:w16sdtdh="http://schemas.microsoft.com/office/word/2020/wordml/sdtdatahash" xmlns:w16sdtfl="http://schemas.microsoft.com/office/word/2024/wordml/sdtformatlock" xmlns:w16se="http://schemas.microsoft.com/office/word/2015/wordml/symex" xmlns:wpg="http://schemas.microsoft.com/office/word/2010/wordprocessingGroup" xmlns:wpi="http://schemas.microsoft.com/office/word/2010/wordprocessingInk" xmlns:wne="http://schemas.microsoft.com/office/word/2006/wordml" xmlns:wps="http://schemas.microsoft.com/office/word/2010/wordprocessingShape" mc:Ignorable="w14 w15 w16se w16cid w16 w16cex w16sdtdh w16sdtfl w16du wp14">
   <w:tbl>
     <w:tblPr>
       <w:tblStyle w:val="Tablaconcuadrcula"/>
@@ -3640,7 +3712,7 @@
 </file>
 
 <file path=word/footnotes.xml><?xml version="1.0" encoding="utf-8"?>
-<w:footnotes xmlns:wpc="http://schemas.microsoft.com/office/word/2010/wordprocessingCanvas" xmlns:cx="http://schemas.microsoft.com/office/drawing/2014/chartex" xmlns:cx1="http://schemas.microsoft.com/office/drawing/2015/9/8/chartex" xmlns:cx2="http://schemas.microsoft.com/office/drawing/2015/10/21/chartex" xmlns:cx3="http://schemas.microsoft.com/office/drawing/2016/5/9/chartex" xmlns:cx4="http://schemas.microsoft.com/office/drawing/2016/5/10/chartex" xmlns:cx5="http://schemas.microsoft.com/office/drawing/2016/5/11/chartex" xmlns:cx6="http://schemas.microsoft.com/office/drawing/2016/5/12/chartex" xmlns:cx7="http://schemas.microsoft.com/office/drawing/2016/5/13/chartex" xmlns:cx8="http://schemas.microsoft.com/office/drawing/2016/5/14/chartex" xmlns:mc="http://schemas.openxmlformats.org/markup-compatibility/2006" xmlns:aink="http://schemas.microsoft.com/office/drawing/2016/ink" xmlns:am3d="http://schemas.microsoft.com/office/drawing/2017/model3d" xmlns:o="urn:schemas-microsoft-com:office:office" xmlns:oel="http://schemas.microsoft.com/office/2019/extlst" xmlns:r="http://schemas.openxmlformats.org/officeDocument/2006/relationships" xmlns:m="http://schemas.openxmlformats.org/officeDocument/2006/math" xmlns:v="urn:schemas-microsoft-com:vml" xmlns:wp14="http://schemas.microsoft.com/office/word/2010/wordprocessingDrawing" xmlns:wp="http://schemas.openxmlformats.org/drawingml/2006/wordprocessingDrawing" xmlns:w10="urn:schemas-microsoft-com:office:word" xmlns:w="http://schemas.openxmlformats.org/wordprocessingml/2006/main" xmlns:w14="http://schemas.microsoft.com/office/word/2010/wordml" xmlns:w15="http://schemas.microsoft.com/office/word/2012/wordml" xmlns:w16cex="http://schemas.microsoft.com/office/word/2018/wordml/cex" xmlns:w16cid="http://schemas.microsoft.com/office/word/2016/wordml/cid" xmlns:w16="http://schemas.microsoft.com/office/word/2018/wordml" xmlns:w16sdtdh="http://schemas.microsoft.com/office/word/2020/wordml/sdtdatahash" xmlns:w16se="http://schemas.microsoft.com/office/word/2015/wordml/symex" xmlns:wpg="http://schemas.microsoft.com/office/word/2010/wordprocessingGroup" xmlns:wpi="http://schemas.microsoft.com/office/word/2010/wordprocessingInk" xmlns:wne="http://schemas.microsoft.com/office/word/2006/wordml" xmlns:wps="http://schemas.microsoft.com/office/word/2010/wordprocessingShape" mc:Ignorable="w14 w15 w16se w16cid w16 w16cex w16sdtdh wp14">
+<w:footnotes xmlns:wpc="http://schemas.microsoft.com/office/word/2010/wordprocessingCanvas" xmlns:cx="http://schemas.microsoft.com/office/drawing/2014/chartex" xmlns:cx1="http://schemas.microsoft.com/office/drawing/2015/9/8/chartex" xmlns:cx2="http://schemas.microsoft.com/office/drawing/2015/10/21/chartex" xmlns:cx3="http://schemas.microsoft.com/office/drawing/2016/5/9/chartex" xmlns:cx4="http://schemas.microsoft.com/office/drawing/2016/5/10/chartex" xmlns:cx5="http://schemas.microsoft.com/office/drawing/2016/5/11/chartex" xmlns:cx6="http://schemas.microsoft.com/office/drawing/2016/5/12/chartex" xmlns:cx7="http://schemas.microsoft.com/office/drawing/2016/5/13/chartex" xmlns:cx8="http://schemas.microsoft.com/office/drawing/2016/5/14/chartex" xmlns:mc="http://schemas.openxmlformats.org/markup-compatibility/2006" xmlns:aink="http://schemas.microsoft.com/office/drawing/2016/ink" xmlns:am3d="http://schemas.microsoft.com/office/drawing/2017/model3d" xmlns:o="urn:schemas-microsoft-com:office:office" xmlns:oel="http://schemas.microsoft.com/office/2019/extlst" xmlns:r="http://schemas.openxmlformats.org/officeDocument/2006/relationships" xmlns:m="http://schemas.openxmlformats.org/officeDocument/2006/math" xmlns:v="urn:schemas-microsoft-com:vml" xmlns:wp14="http://schemas.microsoft.com/office/word/2010/wordprocessingDrawing" xmlns:wp="http://schemas.openxmlformats.org/drawingml/2006/wordprocessingDrawing" xmlns:w10="urn:schemas-microsoft-com:office:word" xmlns:w="http://schemas.openxmlformats.org/wordprocessingml/2006/main" xmlns:w14="http://schemas.microsoft.com/office/word/2010/wordml" xmlns:w15="http://schemas.microsoft.com/office/word/2012/wordml" xmlns:w16cex="http://schemas.microsoft.com/office/word/2018/wordml/cex" xmlns:w16cid="http://schemas.microsoft.com/office/word/2016/wordml/cid" xmlns:w16="http://schemas.microsoft.com/office/word/2018/wordml" xmlns:w16du="http://schemas.microsoft.com/office/word/2023/wordml/word16du" xmlns:w16sdtdh="http://schemas.microsoft.com/office/word/2020/wordml/sdtdatahash" xmlns:w16sdtfl="http://schemas.microsoft.com/office/word/2024/wordml/sdtformatlock" xmlns:w16se="http://schemas.microsoft.com/office/word/2015/wordml/symex" xmlns:wpg="http://schemas.microsoft.com/office/word/2010/wordprocessingGroup" xmlns:wpi="http://schemas.microsoft.com/office/word/2010/wordprocessingInk" xmlns:wne="http://schemas.microsoft.com/office/word/2006/wordml" xmlns:wps="http://schemas.microsoft.com/office/word/2010/wordprocessingShape" mc:Ignorable="w14 w15 w16se w16cid w16 w16cex w16sdtdh w16sdtfl w16du wp14">
   <w:footnote w:type="separator" w:id="-1">
     <w:p>
       <w:pPr>
@@ -3665,7 +3737,7 @@
 </file>
 
 <file path=word/header1.xml><?xml version="1.0" encoding="utf-8"?>
-<w:hdr xmlns:wpc="http://schemas.microsoft.com/office/word/2010/wordprocessingCanvas" xmlns:cx="http://schemas.microsoft.com/office/drawing/2014/chartex" xmlns:cx1="http://schemas.microsoft.com/office/drawing/2015/9/8/chartex" xmlns:cx2="http://schemas.microsoft.com/office/drawing/2015/10/21/chartex" xmlns:cx3="http://schemas.microsoft.com/office/drawing/2016/5/9/chartex" xmlns:cx4="http://schemas.microsoft.com/office/drawing/2016/5/10/chartex" xmlns:cx5="http://schemas.microsoft.com/office/drawing/2016/5/11/chartex" xmlns:cx6="http://schemas.microsoft.com/office/drawing/2016/5/12/chartex" xmlns:cx7="http://schemas.microsoft.com/office/drawing/2016/5/13/chartex" xmlns:cx8="http://schemas.microsoft.com/office/drawing/2016/5/14/chartex" xmlns:mc="http://schemas.openxmlformats.org/markup-compatibility/2006" xmlns:aink="http://schemas.microsoft.com/office/drawing/2016/ink" xmlns:am3d="http://schemas.microsoft.com/office/drawing/2017/model3d" xmlns:o="urn:schemas-microsoft-com:office:office" xmlns:oel="http://schemas.microsoft.com/office/2019/extlst" xmlns:r="http://schemas.openxmlformats.org/officeDocument/2006/relationships" xmlns:m="http://schemas.openxmlformats.org/officeDocument/2006/math" xmlns:v="urn:schemas-microsoft-com:vml" xmlns:wp14="http://schemas.microsoft.com/office/word/2010/wordprocessingDrawing" xmlns:wp="http://schemas.openxmlformats.org/drawingml/2006/wordprocessingDrawing" xmlns:w10="urn:schemas-microsoft-com:office:word" xmlns:w="http://schemas.openxmlformats.org/wordprocessingml/2006/main" xmlns:w14="http://schemas.microsoft.com/office/word/2010/wordml" xmlns:w15="http://schemas.microsoft.com/office/word/2012/wordml" xmlns:w16cex="http://schemas.microsoft.com/office/word/2018/wordml/cex" xmlns:w16cid="http://schemas.microsoft.com/office/word/2016/wordml/cid" xmlns:w16="http://schemas.microsoft.com/office/word/2018/wordml" xmlns:w16sdtdh="http://schemas.microsoft.com/office/word/2020/wordml/sdtdatahash" xmlns:w16se="http://schemas.microsoft.com/office/word/2015/wordml/symex" xmlns:wpg="http://schemas.microsoft.com/office/word/2010/wordprocessingGroup" xmlns:wpi="http://schemas.microsoft.com/office/word/2010/wordprocessingInk" xmlns:wne="http://schemas.microsoft.com/office/word/2006/wordml" xmlns:wps="http://schemas.microsoft.com/office/word/2010/wordprocessingShape" mc:Ignorable="w14 w15 w16se w16cid w16 w16cex w16sdtdh wp14">
+<w:hdr xmlns:wpc="http://schemas.microsoft.com/office/word/2010/wordprocessingCanvas" xmlns:cx="http://schemas.microsoft.com/office/drawing/2014/chartex" xmlns:cx1="http://schemas.microsoft.com/office/drawing/2015/9/8/chartex" xmlns:cx2="http://schemas.microsoft.com/office/drawing/2015/10/21/chartex" xmlns:cx3="http://schemas.microsoft.com/office/drawing/2016/5/9/chartex" xmlns:cx4="http://schemas.microsoft.com/office/drawing/2016/5/10/chartex" xmlns:cx5="http://schemas.microsoft.com/office/drawing/2016/5/11/chartex" xmlns:cx6="http://schemas.microsoft.com/office/drawing/2016/5/12/chartex" xmlns:cx7="http://schemas.microsoft.com/office/drawing/2016/5/13/chartex" xmlns:cx8="http://schemas.microsoft.com/office/drawing/2016/5/14/chartex" xmlns:mc="http://schemas.openxmlformats.org/markup-compatibility/2006" xmlns:aink="http://schemas.microsoft.com/office/drawing/2016/ink" xmlns:am3d="http://schemas.microsoft.com/office/drawing/2017/model3d" xmlns:o="urn:schemas-microsoft-com:office:office" xmlns:oel="http://schemas.microsoft.com/office/2019/extlst" xmlns:r="http://schemas.openxmlformats.org/officeDocument/2006/relationships" xmlns:m="http://schemas.openxmlformats.org/officeDocument/2006/math" xmlns:v="urn:schemas-microsoft-com:vml" xmlns:wp14="http://schemas.microsoft.com/office/word/2010/wordprocessingDrawing" xmlns:wp="http://schemas.openxmlformats.org/drawingml/2006/wordprocessingDrawing" xmlns:w10="urn:schemas-microsoft-com:office:word" xmlns:w="http://schemas.openxmlformats.org/wordprocessingml/2006/main" xmlns:w14="http://schemas.microsoft.com/office/word/2010/wordml" xmlns:w15="http://schemas.microsoft.com/office/word/2012/wordml" xmlns:w16cex="http://schemas.microsoft.com/office/word/2018/wordml/cex" xmlns:w16cid="http://schemas.microsoft.com/office/word/2016/wordml/cid" xmlns:w16="http://schemas.microsoft.com/office/word/2018/wordml" xmlns:w16du="http://schemas.microsoft.com/office/word/2023/wordml/word16du" xmlns:w16sdtdh="http://schemas.microsoft.com/office/word/2020/wordml/sdtdatahash" xmlns:w16sdtfl="http://schemas.microsoft.com/office/word/2024/wordml/sdtformatlock" xmlns:w16se="http://schemas.microsoft.com/office/word/2015/wordml/symex" xmlns:wpg="http://schemas.microsoft.com/office/word/2010/wordprocessingGroup" xmlns:wpi="http://schemas.microsoft.com/office/word/2010/wordprocessingInk" xmlns:wne="http://schemas.microsoft.com/office/word/2006/wordml" xmlns:wps="http://schemas.microsoft.com/office/word/2010/wordprocessingShape" mc:Ignorable="w14 w15 w16se w16cid w16 w16cex w16sdtdh w16sdtfl w16du wp14">
   <w:p>
     <w:pPr>
       <w:pStyle w:val="Encabezado"/>
@@ -3675,7 +3747,7 @@
 </file>
 
 <file path=word/header2.xml><?xml version="1.0" encoding="utf-8"?>
-<w:hdr xmlns:wpc="http://schemas.microsoft.com/office/word/2010/wordprocessingCanvas" xmlns:cx="http://schemas.microsoft.com/office/drawing/2014/chartex" xmlns:cx1="http://schemas.microsoft.com/office/drawing/2015/9/8/chartex" xmlns:cx2="http://schemas.microsoft.com/office/drawing/2015/10/21/chartex" xmlns:cx3="http://schemas.microsoft.com/office/drawing/2016/5/9/chartex" xmlns:cx4="http://schemas.microsoft.com/office/drawing/2016/5/10/chartex" xmlns:cx5="http://schemas.microsoft.com/office/drawing/2016/5/11/chartex" xmlns:cx6="http://schemas.microsoft.com/office/drawing/2016/5/12/chartex" xmlns:cx7="http://schemas.microsoft.com/office/drawing/2016/5/13/chartex" xmlns:cx8="http://schemas.microsoft.com/office/drawing/2016/5/14/chartex" xmlns:mc="http://schemas.openxmlformats.org/markup-compatibility/2006" xmlns:aink="http://schemas.microsoft.com/office/drawing/2016/ink" xmlns:am3d="http://schemas.microsoft.com/office/drawing/2017/model3d" xmlns:o="urn:schemas-microsoft-com:office:office" xmlns:oel="http://schemas.microsoft.com/office/2019/extlst" xmlns:r="http://schemas.openxmlformats.org/officeDocument/2006/relationships" xmlns:m="http://schemas.openxmlformats.org/officeDocument/2006/math" xmlns:v="urn:schemas-microsoft-com:vml" xmlns:wp14="http://schemas.microsoft.com/office/word/2010/wordprocessingDrawing" xmlns:wp="http://schemas.openxmlformats.org/drawingml/2006/wordprocessingDrawing" xmlns:w10="urn:schemas-microsoft-com:office:word" xmlns:w="http://schemas.openxmlformats.org/wordprocessingml/2006/main" xmlns:w14="http://schemas.microsoft.com/office/word/2010/wordml" xmlns:w15="http://schemas.microsoft.com/office/word/2012/wordml" xmlns:w16cex="http://schemas.microsoft.com/office/word/2018/wordml/cex" xmlns:w16cid="http://schemas.microsoft.com/office/word/2016/wordml/cid" xmlns:w16="http://schemas.microsoft.com/office/word/2018/wordml" xmlns:w16sdtdh="http://schemas.microsoft.com/office/word/2020/wordml/sdtdatahash" xmlns:w16se="http://schemas.microsoft.com/office/word/2015/wordml/symex" xmlns:wpg="http://schemas.microsoft.com/office/word/2010/wordprocessingGroup" xmlns:wpi="http://schemas.microsoft.com/office/word/2010/wordprocessingInk" xmlns:wne="http://schemas.microsoft.com/office/word/2006/wordml" xmlns:wps="http://schemas.microsoft.com/office/word/2010/wordprocessingShape" mc:Ignorable="w14 w15 w16se w16cid w16 w16cex w16sdtdh wp14">
+<w:hdr xmlns:wpc="http://schemas.microsoft.com/office/word/2010/wordprocessingCanvas" xmlns:cx="http://schemas.microsoft.com/office/drawing/2014/chartex" xmlns:cx1="http://schemas.microsoft.com/office/drawing/2015/9/8/chartex" xmlns:cx2="http://schemas.microsoft.com/office/drawing/2015/10/21/chartex" xmlns:cx3="http://schemas.microsoft.com/office/drawing/2016/5/9/chartex" xmlns:cx4="http://schemas.microsoft.com/office/drawing/2016/5/10/chartex" xmlns:cx5="http://schemas.microsoft.com/office/drawing/2016/5/11/chartex" xmlns:cx6="http://schemas.microsoft.com/office/drawing/2016/5/12/chartex" xmlns:cx7="http://schemas.microsoft.com/office/drawing/2016/5/13/chartex" xmlns:cx8="http://schemas.microsoft.com/office/drawing/2016/5/14/chartex" xmlns:mc="http://schemas.openxmlformats.org/markup-compatibility/2006" xmlns:aink="http://schemas.microsoft.com/office/drawing/2016/ink" xmlns:am3d="http://schemas.microsoft.com/office/drawing/2017/model3d" xmlns:o="urn:schemas-microsoft-com:office:office" xmlns:oel="http://schemas.microsoft.com/office/2019/extlst" xmlns:r="http://schemas.openxmlformats.org/officeDocument/2006/relationships" xmlns:m="http://schemas.openxmlformats.org/officeDocument/2006/math" xmlns:v="urn:schemas-microsoft-com:vml" xmlns:wp14="http://schemas.microsoft.com/office/word/2010/wordprocessingDrawing" xmlns:wp="http://schemas.openxmlformats.org/drawingml/2006/wordprocessingDrawing" xmlns:w10="urn:schemas-microsoft-com:office:word" xmlns:w="http://schemas.openxmlformats.org/wordprocessingml/2006/main" xmlns:w14="http://schemas.microsoft.com/office/word/2010/wordml" xmlns:w15="http://schemas.microsoft.com/office/word/2012/wordml" xmlns:w16cex="http://schemas.microsoft.com/office/word/2018/wordml/cex" xmlns:w16cid="http://schemas.microsoft.com/office/word/2016/wordml/cid" xmlns:w16="http://schemas.microsoft.com/office/word/2018/wordml" xmlns:w16du="http://schemas.microsoft.com/office/word/2023/wordml/word16du" xmlns:w16sdtdh="http://schemas.microsoft.com/office/word/2020/wordml/sdtdatahash" xmlns:w16sdtfl="http://schemas.microsoft.com/office/word/2024/wordml/sdtformatlock" xmlns:w16se="http://schemas.microsoft.com/office/word/2015/wordml/symex" xmlns:wpg="http://schemas.microsoft.com/office/word/2010/wordprocessingGroup" xmlns:wpi="http://schemas.microsoft.com/office/word/2010/wordprocessingInk" xmlns:wne="http://schemas.microsoft.com/office/word/2006/wordml" xmlns:wps="http://schemas.microsoft.com/office/word/2010/wordprocessingShape" mc:Ignorable="w14 w15 w16se w16cid w16 w16cex w16sdtdh w16sdtfl w16du wp14">
   <w:tbl>
     <w:tblPr>
       <w:tblStyle w:val="Tablaconcuadrcula"/>
@@ -3857,7 +3929,7 @@
 </file>
 
 <file path=word/header3.xml><?xml version="1.0" encoding="utf-8"?>
-<w:hdr xmlns:wpc="http://schemas.microsoft.com/office/word/2010/wordprocessingCanvas" xmlns:cx="http://schemas.microsoft.com/office/drawing/2014/chartex" xmlns:cx1="http://schemas.microsoft.com/office/drawing/2015/9/8/chartex" xmlns:cx2="http://schemas.microsoft.com/office/drawing/2015/10/21/chartex" xmlns:cx3="http://schemas.microsoft.com/office/drawing/2016/5/9/chartex" xmlns:cx4="http://schemas.microsoft.com/office/drawing/2016/5/10/chartex" xmlns:cx5="http://schemas.microsoft.com/office/drawing/2016/5/11/chartex" xmlns:cx6="http://schemas.microsoft.com/office/drawing/2016/5/12/chartex" xmlns:cx7="http://schemas.microsoft.com/office/drawing/2016/5/13/chartex" xmlns:cx8="http://schemas.microsoft.com/office/drawing/2016/5/14/chartex" xmlns:mc="http://schemas.openxmlformats.org/markup-compatibility/2006" xmlns:aink="http://schemas.microsoft.com/office/drawing/2016/ink" xmlns:am3d="http://schemas.microsoft.com/office/drawing/2017/model3d" xmlns:o="urn:schemas-microsoft-com:office:office" xmlns:oel="http://schemas.microsoft.com/office/2019/extlst" xmlns:r="http://schemas.openxmlformats.org/officeDocument/2006/relationships" xmlns:m="http://schemas.openxmlformats.org/officeDocument/2006/math" xmlns:v="urn:schemas-microsoft-com:vml" xmlns:wp14="http://schemas.microsoft.com/office/word/2010/wordprocessingDrawing" xmlns:wp="http://schemas.openxmlformats.org/drawingml/2006/wordprocessingDrawing" xmlns:w10="urn:schemas-microsoft-com:office:word" xmlns:w="http://schemas.openxmlformats.org/wordprocessingml/2006/main" xmlns:w14="http://schemas.microsoft.com/office/word/2010/wordml" xmlns:w15="http://schemas.microsoft.com/office/word/2012/wordml" xmlns:w16cex="http://schemas.microsoft.com/office/word/2018/wordml/cex" xmlns:w16cid="http://schemas.microsoft.com/office/word/2016/wordml/cid" xmlns:w16="http://schemas.microsoft.com/office/word/2018/wordml" xmlns:w16sdtdh="http://schemas.microsoft.com/office/word/2020/wordml/sdtdatahash" xmlns:w16se="http://schemas.microsoft.com/office/word/2015/wordml/symex" xmlns:wpg="http://schemas.microsoft.com/office/word/2010/wordprocessingGroup" xmlns:wpi="http://schemas.microsoft.com/office/word/2010/wordprocessingInk" xmlns:wne="http://schemas.microsoft.com/office/word/2006/wordml" xmlns:wps="http://schemas.microsoft.com/office/word/2010/wordprocessingShape" mc:Ignorable="w14 w15 w16se w16cid w16 w16cex w16sdtdh wp14">
+<w:hdr xmlns:wpc="http://schemas.microsoft.com/office/word/2010/wordprocessingCanvas" xmlns:cx="http://schemas.microsoft.com/office/drawing/2014/chartex" xmlns:cx1="http://schemas.microsoft.com/office/drawing/2015/9/8/chartex" xmlns:cx2="http://schemas.microsoft.com/office/drawing/2015/10/21/chartex" xmlns:cx3="http://schemas.microsoft.com/office/drawing/2016/5/9/chartex" xmlns:cx4="http://schemas.microsoft.com/office/drawing/2016/5/10/chartex" xmlns:cx5="http://schemas.microsoft.com/office/drawing/2016/5/11/chartex" xmlns:cx6="http://schemas.microsoft.com/office/drawing/2016/5/12/chartex" xmlns:cx7="http://schemas.microsoft.com/office/drawing/2016/5/13/chartex" xmlns:cx8="http://schemas.microsoft.com/office/drawing/2016/5/14/chartex" xmlns:mc="http://schemas.openxmlformats.org/markup-compatibility/2006" xmlns:aink="http://schemas.microsoft.com/office/drawing/2016/ink" xmlns:am3d="http://schemas.microsoft.com/office/drawing/2017/model3d" xmlns:o="urn:schemas-microsoft-com:office:office" xmlns:oel="http://schemas.microsoft.com/office/2019/extlst" xmlns:r="http://schemas.openxmlformats.org/officeDocument/2006/relationships" xmlns:m="http://schemas.openxmlformats.org/officeDocument/2006/math" xmlns:v="urn:schemas-microsoft-com:vml" xmlns:wp14="http://schemas.microsoft.com/office/word/2010/wordprocessingDrawing" xmlns:wp="http://schemas.openxmlformats.org/drawingml/2006/wordprocessingDrawing" xmlns:w10="urn:schemas-microsoft-com:office:word" xmlns:w="http://schemas.openxmlformats.org/wordprocessingml/2006/main" xmlns:w14="http://schemas.microsoft.com/office/word/2010/wordml" xmlns:w15="http://schemas.microsoft.com/office/word/2012/wordml" xmlns:w16cex="http://schemas.microsoft.com/office/word/2018/wordml/cex" xmlns:w16cid="http://schemas.microsoft.com/office/word/2016/wordml/cid" xmlns:w16="http://schemas.microsoft.com/office/word/2018/wordml" xmlns:w16du="http://schemas.microsoft.com/office/word/2023/wordml/word16du" xmlns:w16sdtdh="http://schemas.microsoft.com/office/word/2020/wordml/sdtdatahash" xmlns:w16sdtfl="http://schemas.microsoft.com/office/word/2024/wordml/sdtformatlock" xmlns:w16se="http://schemas.microsoft.com/office/word/2015/wordml/symex" xmlns:wpg="http://schemas.microsoft.com/office/word/2010/wordprocessingGroup" xmlns:wpi="http://schemas.microsoft.com/office/word/2010/wordprocessingInk" xmlns:wne="http://schemas.microsoft.com/office/word/2006/wordml" xmlns:wps="http://schemas.microsoft.com/office/word/2010/wordprocessingShape" mc:Ignorable="w14 w15 w16se w16cid w16 w16cex w16sdtdh w16sdtfl w16du wp14">
   <w:p>
     <w:pPr>
       <w:pStyle w:val="Encabezado"/>
@@ -3867,7 +3939,7 @@
 </file>
 
 <file path=word/styles.xml><?xml version="1.0" encoding="utf-8"?>
-<w:styles xmlns:mc="http://schemas.openxmlformats.org/markup-compatibility/2006" xmlns:r="http://schemas.openxmlformats.org/officeDocument/2006/relationships" xmlns:w="http://schemas.openxmlformats.org/wordprocessingml/2006/main" xmlns:w14="http://schemas.microsoft.com/office/word/2010/wordml" xmlns:w15="http://schemas.microsoft.com/office/word/2012/wordml" xmlns:w16cex="http://schemas.microsoft.com/office/word/2018/wordml/cex" xmlns:w16cid="http://schemas.microsoft.com/office/word/2016/wordml/cid" xmlns:w16="http://schemas.microsoft.com/office/word/2018/wordml" xmlns:w16sdtdh="http://schemas.microsoft.com/office/word/2020/wordml/sdtdatahash" xmlns:w16se="http://schemas.microsoft.com/office/word/2015/wordml/symex" mc:Ignorable="w14 w15 w16se w16cid w16 w16cex w16sdtdh">
+<w:styles xmlns:mc="http://schemas.openxmlformats.org/markup-compatibility/2006" xmlns:r="http://schemas.openxmlformats.org/officeDocument/2006/relationships" xmlns:w="http://schemas.openxmlformats.org/wordprocessingml/2006/main" xmlns:w14="http://schemas.microsoft.com/office/word/2010/wordml" xmlns:w15="http://schemas.microsoft.com/office/word/2012/wordml" xmlns:w16cex="http://schemas.microsoft.com/office/word/2018/wordml/cex" xmlns:w16cid="http://schemas.microsoft.com/office/word/2016/wordml/cid" xmlns:w16="http://schemas.microsoft.com/office/word/2018/wordml" xmlns:w16du="http://schemas.microsoft.com/office/word/2023/wordml/word16du" xmlns:w16sdtdh="http://schemas.microsoft.com/office/word/2020/wordml/sdtdatahash" xmlns:w16sdtfl="http://schemas.microsoft.com/office/word/2024/wordml/sdtformatlock" xmlns:w16se="http://schemas.microsoft.com/office/word/2015/wordml/symex" mc:Ignorable="w14 w15 w16se w16cid w16 w16cex w16sdtdh w16sdtfl w16du">
   <w:docDefaults>
     <w:rPrDefault>
       <w:rPr>
@@ -5029,7 +5101,7 @@
 </file>
 
 <file path=word/glossary/document.xml><?xml version="1.0" encoding="utf-8"?>
-<w:glossaryDocument xmlns:wpc="http://schemas.microsoft.com/office/word/2010/wordprocessingCanvas" xmlns:cx="http://schemas.microsoft.com/office/drawing/2014/chartex" xmlns:cx1="http://schemas.microsoft.com/office/drawing/2015/9/8/chartex" xmlns:cx2="http://schemas.microsoft.com/office/drawing/2015/10/21/chartex" xmlns:cx3="http://schemas.microsoft.com/office/drawing/2016/5/9/chartex" xmlns:cx4="http://schemas.microsoft.com/office/drawing/2016/5/10/chartex" xmlns:cx5="http://schemas.microsoft.com/office/drawing/2016/5/11/chartex" xmlns:cx6="http://schemas.microsoft.com/office/drawing/2016/5/12/chartex" xmlns:cx7="http://schemas.microsoft.com/office/drawing/2016/5/13/chartex" xmlns:cx8="http://schemas.microsoft.com/office/drawing/2016/5/14/chartex" xmlns:mc="http://schemas.openxmlformats.org/markup-compatibility/2006" xmlns:aink="http://schemas.microsoft.com/office/drawing/2016/ink" xmlns:am3d="http://schemas.microsoft.com/office/drawing/2017/model3d" xmlns:o="urn:schemas-microsoft-com:office:office" xmlns:oel="http://schemas.microsoft.com/office/2019/extlst" xmlns:r="http://schemas.openxmlformats.org/officeDocument/2006/relationships" xmlns:m="http://schemas.openxmlformats.org/officeDocument/2006/math" xmlns:v="urn:schemas-microsoft-com:vml" xmlns:wp14="http://schemas.microsoft.com/office/word/2010/wordprocessingDrawing" xmlns:wp="http://schemas.openxmlformats.org/drawingml/2006/wordprocessingDrawing" xmlns:w10="urn:schemas-microsoft-com:office:word" xmlns:w="http://schemas.openxmlformats.org/wordprocessingml/2006/main" xmlns:w14="http://schemas.microsoft.com/office/word/2010/wordml" xmlns:w15="http://schemas.microsoft.com/office/word/2012/wordml" xmlns:w16cex="http://schemas.microsoft.com/office/word/2018/wordml/cex" xmlns:w16cid="http://schemas.microsoft.com/office/word/2016/wordml/cid" xmlns:w16="http://schemas.microsoft.com/office/word/2018/wordml" xmlns:w16sdtdh="http://schemas.microsoft.com/office/word/2020/wordml/sdtdatahash" xmlns:w16se="http://schemas.microsoft.com/office/word/2015/wordml/symex" xmlns:wpg="http://schemas.microsoft.com/office/word/2010/wordprocessingGroup" xmlns:wpi="http://schemas.microsoft.com/office/word/2010/wordprocessingInk" xmlns:wne="http://schemas.microsoft.com/office/word/2006/wordml" xmlns:wps="http://schemas.microsoft.com/office/word/2010/wordprocessingShape" mc:Ignorable="w14 w15 w16se w16cid w16 w16cex w16sdtdh wp14">
+<w:glossaryDocument xmlns:wpc="http://schemas.microsoft.com/office/word/2010/wordprocessingCanvas" xmlns:cx="http://schemas.microsoft.com/office/drawing/2014/chartex" xmlns:cx1="http://schemas.microsoft.com/office/drawing/2015/9/8/chartex" xmlns:cx2="http://schemas.microsoft.com/office/drawing/2015/10/21/chartex" xmlns:cx3="http://schemas.microsoft.com/office/drawing/2016/5/9/chartex" xmlns:cx4="http://schemas.microsoft.com/office/drawing/2016/5/10/chartex" xmlns:cx5="http://schemas.microsoft.com/office/drawing/2016/5/11/chartex" xmlns:cx6="http://schemas.microsoft.com/office/drawing/2016/5/12/chartex" xmlns:cx7="http://schemas.microsoft.com/office/drawing/2016/5/13/chartex" xmlns:cx8="http://schemas.microsoft.com/office/drawing/2016/5/14/chartex" xmlns:mc="http://schemas.openxmlformats.org/markup-compatibility/2006" xmlns:aink="http://schemas.microsoft.com/office/drawing/2016/ink" xmlns:am3d="http://schemas.microsoft.com/office/drawing/2017/model3d" xmlns:o="urn:schemas-microsoft-com:office:office" xmlns:oel="http://schemas.microsoft.com/office/2019/extlst" xmlns:r="http://schemas.openxmlformats.org/officeDocument/2006/relationships" xmlns:m="http://schemas.openxmlformats.org/officeDocument/2006/math" xmlns:v="urn:schemas-microsoft-com:vml" xmlns:wp14="http://schemas.microsoft.com/office/word/2010/wordprocessingDrawing" xmlns:wp="http://schemas.openxmlformats.org/drawingml/2006/wordprocessingDrawing" xmlns:w10="urn:schemas-microsoft-com:office:word" xmlns:w="http://schemas.openxmlformats.org/wordprocessingml/2006/main" xmlns:w14="http://schemas.microsoft.com/office/word/2010/wordml" xmlns:w15="http://schemas.microsoft.com/office/word/2012/wordml" xmlns:w16cex="http://schemas.microsoft.com/office/word/2018/wordml/cex" xmlns:w16cid="http://schemas.microsoft.com/office/word/2016/wordml/cid" xmlns:w16="http://schemas.microsoft.com/office/word/2018/wordml" xmlns:w16du="http://schemas.microsoft.com/office/word/2023/wordml/word16du" xmlns:w16sdtdh="http://schemas.microsoft.com/office/word/2020/wordml/sdtdatahash" xmlns:w16sdtfl="http://schemas.microsoft.com/office/word/2024/wordml/sdtformatlock" xmlns:w16se="http://schemas.microsoft.com/office/word/2015/wordml/symex" xmlns:wpg="http://schemas.microsoft.com/office/word/2010/wordprocessingGroup" xmlns:wpi="http://schemas.microsoft.com/office/word/2010/wordprocessingInk" xmlns:wne="http://schemas.microsoft.com/office/word/2006/wordml" xmlns:wps="http://schemas.microsoft.com/office/word/2010/wordprocessingShape" mc:Ignorable="w14 w15 w16se w16cid w16 w16cex w16sdtdh w16sdtfl w16du wp14">
   <w:docParts>
     <w:docPart>
       <w:docPartPr>
@@ -5288,35 +5360,6 @@
     </w:docPart>
     <w:docPart>
       <w:docPartPr>
-        <w:name w:val="F42A0F919AF247C4B014FCC7C8DB1764"/>
-        <w:category>
-          <w:name w:val="General"/>
-          <w:gallery w:val="placeholder"/>
-        </w:category>
-        <w:types>
-          <w:type w:val="bbPlcHdr"/>
-        </w:types>
-        <w:behaviors>
-          <w:behavior w:val="content"/>
-        </w:behaviors>
-        <w:guid w:val="{314185B0-29BF-420A-B970-496F32D6FBCD}"/>
-      </w:docPartPr>
-      <w:docPartBody>
-        <w:p>
-          <w:pPr>
-            <w:pStyle w:val="F42A0F919AF247C4B014FCC7C8DB1764"/>
-          </w:pPr>
-          <w:r>
-            <w:rPr>
-              <w:rStyle w:val="Textodelmarcadordeposicin"/>
-            </w:rPr>
-            <w:t>Click or tap here to enter text.</w:t>
-          </w:r>
-        </w:p>
-      </w:docPartBody>
-    </w:docPart>
-    <w:docPart>
-      <w:docPartPr>
         <w:name w:val="BF3395F19E1C42AEA918E68F87C3A9B1"/>
         <w:category>
           <w:name w:val="General"/>
@@ -5375,35 +5418,6 @@
     </w:docPart>
     <w:docPart>
       <w:docPartPr>
-        <w:name w:val="29C1C062BD834767BAEE000994A6B181"/>
-        <w:category>
-          <w:name w:val="General"/>
-          <w:gallery w:val="placeholder"/>
-        </w:category>
-        <w:types>
-          <w:type w:val="bbPlcHdr"/>
-        </w:types>
-        <w:behaviors>
-          <w:behavior w:val="content"/>
-        </w:behaviors>
-        <w:guid w:val="{7C6D6596-FB0A-407E-A2CB-856879D518DE}"/>
-      </w:docPartPr>
-      <w:docPartBody>
-        <w:p>
-          <w:pPr>
-            <w:pStyle w:val="29C1C062BD834767BAEE000994A6B181"/>
-          </w:pPr>
-          <w:r>
-            <w:rPr>
-              <w:rStyle w:val="Textodelmarcadordeposicin"/>
-            </w:rPr>
-            <w:t>Click or tap here to enter text.</w:t>
-          </w:r>
-        </w:p>
-      </w:docPartBody>
-    </w:docPart>
-    <w:docPart>
-      <w:docPartPr>
         <w:name w:val="526AB862EBA746CBB245CB06E0E17DF8"/>
         <w:category>
           <w:name w:val="General"/>
@@ -5462,35 +5476,6 @@
     </w:docPart>
     <w:docPart>
       <w:docPartPr>
-        <w:name w:val="068D40E5187643C3AB0DC1E56D6FD480"/>
-        <w:category>
-          <w:name w:val="General"/>
-          <w:gallery w:val="placeholder"/>
-        </w:category>
-        <w:types>
-          <w:type w:val="bbPlcHdr"/>
-        </w:types>
-        <w:behaviors>
-          <w:behavior w:val="content"/>
-        </w:behaviors>
-        <w:guid w:val="{7FD5CCB8-8593-40C1-BE2E-0B0C463AFA66}"/>
-      </w:docPartPr>
-      <w:docPartBody>
-        <w:p>
-          <w:pPr>
-            <w:pStyle w:val="068D40E5187643C3AB0DC1E56D6FD480"/>
-          </w:pPr>
-          <w:r>
-            <w:rPr>
-              <w:rStyle w:val="Textodelmarcadordeposicin"/>
-            </w:rPr>
-            <w:t>Click or tap here to enter text.</w:t>
-          </w:r>
-        </w:p>
-      </w:docPartBody>
-    </w:docPart>
-    <w:docPart>
-      <w:docPartPr>
         <w:name w:val="56BACEE3427B4515B1312F2C2A70572D"/>
         <w:category>
           <w:name w:val="General"/>
@@ -5514,35 +5499,6 @@
               <w:rStyle w:val="Textodelmarcadordeposicin"/>
             </w:rPr>
             <w:t>Click here to enter text.</w:t>
-          </w:r>
-        </w:p>
-      </w:docPartBody>
-    </w:docPart>
-    <w:docPart>
-      <w:docPartPr>
-        <w:name w:val="F14BA88672C444DDB23BF9227B557931"/>
-        <w:category>
-          <w:name w:val="General"/>
-          <w:gallery w:val="placeholder"/>
-        </w:category>
-        <w:types>
-          <w:type w:val="bbPlcHdr"/>
-        </w:types>
-        <w:behaviors>
-          <w:behavior w:val="content"/>
-        </w:behaviors>
-        <w:guid w:val="{39EC212F-08EA-4CFE-87C4-A637CB807EE5}"/>
-      </w:docPartPr>
-      <w:docPartBody>
-        <w:p>
-          <w:pPr>
-            <w:pStyle w:val="F14BA88672C444DDB23BF9227B557931"/>
-          </w:pPr>
-          <w:r>
-            <w:rPr>
-              <w:rStyle w:val="Textodelmarcadordeposicin"/>
-            </w:rPr>
-            <w:t>Click or tap here to enter text.</w:t>
           </w:r>
         </w:p>
       </w:docPartBody>
@@ -5578,35 +5534,6 @@
     </w:docPart>
     <w:docPart>
       <w:docPartPr>
-        <w:name w:val="40538E0F8B3A4106A553DF036562555C"/>
-        <w:category>
-          <w:name w:val="General"/>
-          <w:gallery w:val="placeholder"/>
-        </w:category>
-        <w:types>
-          <w:type w:val="bbPlcHdr"/>
-        </w:types>
-        <w:behaviors>
-          <w:behavior w:val="content"/>
-        </w:behaviors>
-        <w:guid w:val="{1C4E95F2-EFDE-4535-B43E-E7AA39F2FCC4}"/>
-      </w:docPartPr>
-      <w:docPartBody>
-        <w:p>
-          <w:pPr>
-            <w:pStyle w:val="40538E0F8B3A4106A553DF036562555C"/>
-          </w:pPr>
-          <w:r>
-            <w:rPr>
-              <w:rStyle w:val="Textodelmarcadordeposicin"/>
-            </w:rPr>
-            <w:t>Click or tap here to enter text.</w:t>
-          </w:r>
-        </w:p>
-      </w:docPartBody>
-    </w:docPart>
-    <w:docPart>
-      <w:docPartPr>
         <w:name w:val="41F74972DC8F43ABAAA4F8638773D01C"/>
         <w:category>
           <w:name w:val="General"/>
@@ -5630,35 +5557,6 @@
               <w:rStyle w:val="Textodelmarcadordeposicin"/>
             </w:rPr>
             <w:t>Click here to enter text.</w:t>
-          </w:r>
-        </w:p>
-      </w:docPartBody>
-    </w:docPart>
-    <w:docPart>
-      <w:docPartPr>
-        <w:name w:val="6AC74AD5E465469D85EBE42897407DAE"/>
-        <w:category>
-          <w:name w:val="General"/>
-          <w:gallery w:val="placeholder"/>
-        </w:category>
-        <w:types>
-          <w:type w:val="bbPlcHdr"/>
-        </w:types>
-        <w:behaviors>
-          <w:behavior w:val="content"/>
-        </w:behaviors>
-        <w:guid w:val="{9C2282BC-C98A-483E-85F9-1552C3196504}"/>
-      </w:docPartPr>
-      <w:docPartBody>
-        <w:p>
-          <w:pPr>
-            <w:pStyle w:val="6AC74AD5E465469D85EBE42897407DAE"/>
-          </w:pPr>
-          <w:r>
-            <w:rPr>
-              <w:rStyle w:val="Textodelmarcadordeposicin"/>
-            </w:rPr>
-            <w:t>Click or tap here to enter text.</w:t>
           </w:r>
         </w:p>
       </w:docPartBody>
@@ -6509,7 +6407,7 @@
 </file>
 
 <file path=word/glossary/fontTable.xml><?xml version="1.0" encoding="utf-8"?>
-<w:fonts xmlns:mc="http://schemas.openxmlformats.org/markup-compatibility/2006" xmlns:r="http://schemas.openxmlformats.org/officeDocument/2006/relationships" xmlns:w="http://schemas.openxmlformats.org/wordprocessingml/2006/main" xmlns:w14="http://schemas.microsoft.com/office/word/2010/wordml" xmlns:w15="http://schemas.microsoft.com/office/word/2012/wordml" xmlns:w16cex="http://schemas.microsoft.com/office/word/2018/wordml/cex" xmlns:w16cid="http://schemas.microsoft.com/office/word/2016/wordml/cid" xmlns:w16="http://schemas.microsoft.com/office/word/2018/wordml" xmlns:w16sdtdh="http://schemas.microsoft.com/office/word/2020/wordml/sdtdatahash" xmlns:w16se="http://schemas.microsoft.com/office/word/2015/wordml/symex" mc:Ignorable="w14 w15 w16se w16cid w16 w16cex w16sdtdh">
+<w:fonts xmlns:mc="http://schemas.openxmlformats.org/markup-compatibility/2006" xmlns:r="http://schemas.openxmlformats.org/officeDocument/2006/relationships" xmlns:w="http://schemas.openxmlformats.org/wordprocessingml/2006/main" xmlns:w14="http://schemas.microsoft.com/office/word/2010/wordml" xmlns:w15="http://schemas.microsoft.com/office/word/2012/wordml" xmlns:w16cex="http://schemas.microsoft.com/office/word/2018/wordml/cex" xmlns:w16cid="http://schemas.microsoft.com/office/word/2016/wordml/cid" xmlns:w16="http://schemas.microsoft.com/office/word/2018/wordml" xmlns:w16du="http://schemas.microsoft.com/office/word/2023/wordml/word16du" xmlns:w16sdtdh="http://schemas.microsoft.com/office/word/2020/wordml/sdtdatahash" xmlns:w16sdtfl="http://schemas.microsoft.com/office/word/2024/wordml/sdtformatlock" xmlns:w16se="http://schemas.microsoft.com/office/word/2015/wordml/symex" mc:Ignorable="w14 w15 w16se w16cid w16 w16cex w16sdtdh w16sdtfl w16du">
   <w:font w:name="Garamond">
     <w:panose1 w:val="02020404030301010803"/>
     <w:charset w:val="00"/>
@@ -6554,7 +6452,7 @@
 </file>
 
 <file path=word/glossary/settings.xml><?xml version="1.0" encoding="utf-8"?>
-<w:settings xmlns:mc="http://schemas.openxmlformats.org/markup-compatibility/2006" xmlns:o="urn:schemas-microsoft-com:office:office" xmlns:r="http://schemas.openxmlformats.org/officeDocument/2006/relationships" xmlns:m="http://schemas.openxmlformats.org/officeDocument/2006/math" xmlns:v="urn:schemas-microsoft-com:vml" xmlns:w10="urn:schemas-microsoft-com:office:word" xmlns:w="http://schemas.openxmlformats.org/wordprocessingml/2006/main" xmlns:w14="http://schemas.microsoft.com/office/word/2010/wordml" xmlns:w15="http://schemas.microsoft.com/office/word/2012/wordml" xmlns:w16cex="http://schemas.microsoft.com/office/word/2018/wordml/cex" xmlns:w16cid="http://schemas.microsoft.com/office/word/2016/wordml/cid" xmlns:w16="http://schemas.microsoft.com/office/word/2018/wordml" xmlns:w16sdtdh="http://schemas.microsoft.com/office/word/2020/wordml/sdtdatahash" xmlns:w16se="http://schemas.microsoft.com/office/word/2015/wordml/symex" xmlns:sl="http://schemas.openxmlformats.org/schemaLibrary/2006/main" mc:Ignorable="w14 w15 w16se w16cid w16 w16cex w16sdtdh">
+<w:settings xmlns:mc="http://schemas.openxmlformats.org/markup-compatibility/2006" xmlns:o="urn:schemas-microsoft-com:office:office" xmlns:r="http://schemas.openxmlformats.org/officeDocument/2006/relationships" xmlns:m="http://schemas.openxmlformats.org/officeDocument/2006/math" xmlns:v="urn:schemas-microsoft-com:vml" xmlns:w10="urn:schemas-microsoft-com:office:word" xmlns:w="http://schemas.openxmlformats.org/wordprocessingml/2006/main" xmlns:w14="http://schemas.microsoft.com/office/word/2010/wordml" xmlns:w15="http://schemas.microsoft.com/office/word/2012/wordml" xmlns:w16cex="http://schemas.microsoft.com/office/word/2018/wordml/cex" xmlns:w16cid="http://schemas.microsoft.com/office/word/2016/wordml/cid" xmlns:w16="http://schemas.microsoft.com/office/word/2018/wordml" xmlns:w16du="http://schemas.microsoft.com/office/word/2023/wordml/word16du" xmlns:w16sdtdh="http://schemas.microsoft.com/office/word/2020/wordml/sdtdatahash" xmlns:w16sdtfl="http://schemas.microsoft.com/office/word/2024/wordml/sdtformatlock" xmlns:w16se="http://schemas.microsoft.com/office/word/2015/wordml/symex" xmlns:sl="http://schemas.openxmlformats.org/schemaLibrary/2006/main" mc:Ignorable="w14 w15 w16se w16cid w16 w16cex w16sdtdh w16sdtfl w16du">
   <w:view w:val="normal"/>
   <w:defaultTabStop w:val="720"/>
   <w:hyphenationZone w:val="425"/>
@@ -6580,12 +6478,14 @@
     <w:rsid w:val="00112B96"/>
     <w:rsid w:val="00122440"/>
     <w:rsid w:val="00150D03"/>
+    <w:rsid w:val="00153748"/>
     <w:rsid w:val="00171665"/>
     <w:rsid w:val="001812B0"/>
     <w:rsid w:val="001C36D4"/>
     <w:rsid w:val="001C4084"/>
     <w:rsid w:val="001E0CAA"/>
     <w:rsid w:val="001E1957"/>
+    <w:rsid w:val="001F699B"/>
     <w:rsid w:val="00253AE8"/>
     <w:rsid w:val="00270D18"/>
     <w:rsid w:val="00271C42"/>
@@ -6606,7 +6506,9 @@
     <w:rsid w:val="00466B71"/>
     <w:rsid w:val="004910D3"/>
     <w:rsid w:val="004C391E"/>
+    <w:rsid w:val="004F733C"/>
     <w:rsid w:val="00532536"/>
+    <w:rsid w:val="0053318F"/>
     <w:rsid w:val="005421E0"/>
     <w:rsid w:val="00564DF9"/>
     <w:rsid w:val="00586AC2"/>
@@ -6626,6 +6528,7 @@
     <w:rsid w:val="007549A5"/>
     <w:rsid w:val="00790D50"/>
     <w:rsid w:val="007B12EF"/>
+    <w:rsid w:val="0080528F"/>
     <w:rsid w:val="00813A13"/>
     <w:rsid w:val="00826A98"/>
     <w:rsid w:val="0085216E"/>
@@ -6633,7 +6536,9 @@
     <w:rsid w:val="008679C5"/>
     <w:rsid w:val="00867D5D"/>
     <w:rsid w:val="00872154"/>
+    <w:rsid w:val="00887250"/>
     <w:rsid w:val="00896619"/>
+    <w:rsid w:val="008E5B3C"/>
     <w:rsid w:val="008F4BA6"/>
     <w:rsid w:val="00926F32"/>
     <w:rsid w:val="00930259"/>
@@ -6641,6 +6546,7 @@
     <w:rsid w:val="00942527"/>
     <w:rsid w:val="00955AB0"/>
     <w:rsid w:val="00966DB3"/>
+    <w:rsid w:val="00972701"/>
     <w:rsid w:val="009B1A13"/>
     <w:rsid w:val="009C1681"/>
     <w:rsid w:val="00A03EDF"/>
@@ -6655,13 +6561,17 @@
     <w:rsid w:val="00AF7409"/>
     <w:rsid w:val="00B0263F"/>
     <w:rsid w:val="00B10196"/>
+    <w:rsid w:val="00B21228"/>
     <w:rsid w:val="00B40BD2"/>
     <w:rsid w:val="00B56AF6"/>
+    <w:rsid w:val="00B64322"/>
     <w:rsid w:val="00B84D80"/>
     <w:rsid w:val="00B97BE1"/>
     <w:rsid w:val="00BA7280"/>
     <w:rsid w:val="00BB0B3B"/>
     <w:rsid w:val="00BF2E66"/>
+    <w:rsid w:val="00C040E8"/>
+    <w:rsid w:val="00C32A2F"/>
     <w:rsid w:val="00C64B99"/>
     <w:rsid w:val="00C93BEB"/>
     <w:rsid w:val="00CB23AC"/>
@@ -6682,12 +6592,14 @@
     <w:rsid w:val="00E44166"/>
     <w:rsid w:val="00E45027"/>
     <w:rsid w:val="00E75C1C"/>
+    <w:rsid w:val="00E822C9"/>
     <w:rsid w:val="00EB1C9F"/>
     <w:rsid w:val="00EB5F8E"/>
     <w:rsid w:val="00EC6782"/>
     <w:rsid w:val="00EF47D9"/>
     <w:rsid w:val="00F05179"/>
     <w:rsid w:val="00F07849"/>
+    <w:rsid w:val="00F43BCA"/>
     <w:rsid w:val="00F65D98"/>
     <w:rsid w:val="00FC7262"/>
     <w:rsid w:val="00FF04E3"/>
@@ -6716,7 +6628,7 @@
 </file>
 
 <file path=word/glossary/styles.xml><?xml version="1.0" encoding="utf-8"?>
-<w:styles xmlns:mc="http://schemas.openxmlformats.org/markup-compatibility/2006" xmlns:r="http://schemas.openxmlformats.org/officeDocument/2006/relationships" xmlns:w="http://schemas.openxmlformats.org/wordprocessingml/2006/main" xmlns:w14="http://schemas.microsoft.com/office/word/2010/wordml" xmlns:w15="http://schemas.microsoft.com/office/word/2012/wordml" xmlns:w16cex="http://schemas.microsoft.com/office/word/2018/wordml/cex" xmlns:w16cid="http://schemas.microsoft.com/office/word/2016/wordml/cid" xmlns:w16="http://schemas.microsoft.com/office/word/2018/wordml" xmlns:w16sdtdh="http://schemas.microsoft.com/office/word/2020/wordml/sdtdatahash" xmlns:w16se="http://schemas.microsoft.com/office/word/2015/wordml/symex" mc:Ignorable="w14 w15 w16se w16cid w16 w16cex w16sdtdh">
+<w:styles xmlns:mc="http://schemas.openxmlformats.org/markup-compatibility/2006" xmlns:r="http://schemas.openxmlformats.org/officeDocument/2006/relationships" xmlns:w="http://schemas.openxmlformats.org/wordprocessingml/2006/main" xmlns:w14="http://schemas.microsoft.com/office/word/2010/wordml" xmlns:w15="http://schemas.microsoft.com/office/word/2012/wordml" xmlns:w16cex="http://schemas.microsoft.com/office/word/2018/wordml/cex" xmlns:w16cid="http://schemas.microsoft.com/office/word/2016/wordml/cid" xmlns:w16="http://schemas.microsoft.com/office/word/2018/wordml" xmlns:w16du="http://schemas.microsoft.com/office/word/2023/wordml/word16du" xmlns:w16sdtdh="http://schemas.microsoft.com/office/word/2020/wordml/sdtdatahash" xmlns:w16sdtfl="http://schemas.microsoft.com/office/word/2024/wordml/sdtformatlock" xmlns:w16se="http://schemas.microsoft.com/office/word/2015/wordml/symex" mc:Ignorable="w14 w15 w16se w16cid w16 w16cex w16sdtdh w16sdtfl w16du">
   <w:docDefaults>
     <w:rPrDefault>
       <w:rPr>
@@ -7146,7 +7058,7 @@
     <w:basedOn w:val="Fuentedeprrafopredeter"/>
     <w:uiPriority w:val="99"/>
     <w:semiHidden/>
-    <w:rsid w:val="00BF2E66"/>
+    <w:rsid w:val="00B21228"/>
   </w:style>
   <w:style w:type="paragraph" w:customStyle="1" w:styleId="CB5E2B847CFD4864B2988CC463AF0FC9">
     <w:name w:val="CB5E2B847CFD4864B2988CC463AF0FC9"/>
@@ -7686,11 +7598,25 @@
       <w14:ligatures w14:val="standardContextual"/>
     </w:rPr>
   </w:style>
+  <w:style w:type="paragraph" w:customStyle="1" w:styleId="412F102EDBCD4C65AA60A58433D0C98B">
+    <w:name w:val="412F102EDBCD4C65AA60A58433D0C98B"/>
+    <w:rsid w:val="00B21228"/>
+    <w:pPr>
+      <w:spacing w:line="278" w:lineRule="auto"/>
+    </w:pPr>
+    <w:rPr>
+      <w:kern w:val="2"/>
+      <w:sz w:val="24"/>
+      <w:szCs w:val="24"/>
+      <w:lang w:val="es-419" w:eastAsia="es-419"/>
+      <w14:ligatures w14:val="standardContextual"/>
+    </w:rPr>
+  </w:style>
 </w:styles>
 </file>
 
 <file path=word/glossary/webSettings.xml><?xml version="1.0" encoding="utf-8"?>
-<w:webSettings xmlns:mc="http://schemas.openxmlformats.org/markup-compatibility/2006" xmlns:r="http://schemas.openxmlformats.org/officeDocument/2006/relationships" xmlns:w="http://schemas.openxmlformats.org/wordprocessingml/2006/main" xmlns:w14="http://schemas.microsoft.com/office/word/2010/wordml" xmlns:w15="http://schemas.microsoft.com/office/word/2012/wordml" xmlns:w16cex="http://schemas.microsoft.com/office/word/2018/wordml/cex" xmlns:w16cid="http://schemas.microsoft.com/office/word/2016/wordml/cid" xmlns:w16="http://schemas.microsoft.com/office/word/2018/wordml" xmlns:w16sdtdh="http://schemas.microsoft.com/office/word/2020/wordml/sdtdatahash" xmlns:w16se="http://schemas.microsoft.com/office/word/2015/wordml/symex" mc:Ignorable="w14 w15 w16se w16cid w16 w16cex w16sdtdh">
+<w:webSettings xmlns:mc="http://schemas.openxmlformats.org/markup-compatibility/2006" xmlns:r="http://schemas.openxmlformats.org/officeDocument/2006/relationships" xmlns:w="http://schemas.openxmlformats.org/wordprocessingml/2006/main" xmlns:w14="http://schemas.microsoft.com/office/word/2010/wordml" xmlns:w15="http://schemas.microsoft.com/office/word/2012/wordml" xmlns:w16cex="http://schemas.microsoft.com/office/word/2018/wordml/cex" xmlns:w16cid="http://schemas.microsoft.com/office/word/2016/wordml/cid" xmlns:w16="http://schemas.microsoft.com/office/word/2018/wordml" xmlns:w16du="http://schemas.microsoft.com/office/word/2023/wordml/word16du" xmlns:w16sdtdh="http://schemas.microsoft.com/office/word/2020/wordml/sdtdatahash" xmlns:w16sdtfl="http://schemas.microsoft.com/office/word/2024/wordml/sdtformatlock" xmlns:w16se="http://schemas.microsoft.com/office/word/2015/wordml/symex" mc:Ignorable="w14 w15 w16se w16cid w16 w16cex w16sdtdh w16sdtfl w16du">
   <w:optimizeForBrowser/>
   <w:allowPNG/>
 </w:webSettings>
@@ -7897,9 +7823,7 @@
 </a:theme>
 </file>
 
-<file path=customXml/item1.xml>��< ? x m l   v e r s i o n = " 1 . 0 "   e n c o d i n g = " u t f - 1 6 " ? > - 
- < N a v W o r d R e p o r t X m l P a r t   x m l n s = " u r n : m i c r o s o f t - d y n a m i c s - n a v / r e p o r t s / S t a n d a r d _ S a l e s _ O r d e r _ C o n f / 1 3 0 5 / " > +<file path=customXml/item1.xml>��< ? x m l   v e r s i o n = " 1 . 0 "   e n c o d i n g = " u t f - 1 6 " ? > < N a v W o r d R e p o r t X m l P a r t   x m l n s = " u r n : m i c r o s o f t - d y n a m i c s - n a v / r e p o r t s / S t a n d a r d _ S a l e s _ O r d e r _ C o n f / 1 3 0 5 / " >   
      < H e a d e r >   
@@ -8136,6 +8060,24 @@
          < S h i p T o A d d r e s s 8 > S h i p T o A d d r e s s 8 < / S h i p T o A d d r e s s 8 >   
          < S h i p T o A d d r e s s _ L b l > S h i p T o A d d r e s s _ L b l < / S h i p T o A d d r e s s _ L b l > + 
+         < S h i p _ t o _ A d d r e s s > S h i p _ t o _ A d d r e s s < / S h i p _ t o _ A d d r e s s > + 
+         < S h i p _ t o _ A d d r e s s _ 2 > S h i p _ t o _ A d d r e s s _ 2 < / S h i p _ t o _ A d d r e s s _ 2 > + 
+         < S h i p _ t o _ C i t y > S h i p _ t o _ C i t y < / S h i p _ t o _ C i t y > + 
+         < S h i p _ t o _ C o n t a c > S h i p _ t o _ C o n t a c < / S h i p _ t o _ C o n t a c > + 
+         < S h i p _ t o _ C o u n t r y _ R e g i o n _ C o d e > S h i p _ t o _ C o u n t r y _ R e g i o n _ C o d e < / S h i p _ t o _ C o u n t r y _ R e g i o n _ C o d e > + 
+         < S h i p _ t o _ C o u n t y > S h i p _ t o _ C o u n t y < / S h i p _ t o _ C o u n t y > + 
+         < S h i p _ t o _ N a m e > S h i p _ t o _ N a m e < / S h i p _ t o _ N a m e > + 
+         < S h i p _ t o _ N a m e _ 2 > S h i p _ t o _ N a m e _ 2 < / S h i p _ t o _ N a m e _ 2 > + 
+         < S h i p _ t o _ P o s t _ C o d e > S h i p _ t o _ P o s t _ C o d e < / S h i p _ t o _ P o s t _ C o d e >   
          < S h o w S h i p p i n g A d d r e s s > S h o w S h i p p i n g A d d r e s s < / S h o w S h i p p i n g A d d r e s s >   

</xml_diff>